<commit_message>
Desarrollo de reflexión final
Se ha subido el desarrollo de la reflexión final del estudiante Benjamín Vargas
</commit_message>
<xml_diff>
--- a/Fase 3/Evidencias individuales/VARGAZ_BENJAMIN_3.1_APT122_DiarioReflexionFase3.docx
+++ b/Fase 3/Evidencias individuales/VARGAZ_BENJAMIN_3.1_APT122_DiarioReflexionFase3.docx
@@ -1,11 +1,11 @@
 
 <file path=word/document.xml><?xml version="1.0" encoding="utf-8"?>
-<w:document xmlns:wpc="http://schemas.microsoft.com/office/word/2010/wordprocessingCanvas" xmlns:cx="http://schemas.microsoft.com/office/drawing/2014/chartex" xmlns:mc="http://schemas.openxmlformats.org/markup-compatibility/2006" xmlns:o="urn:schemas-microsoft-com:office:office" xmlns:r="http://schemas.openxmlformats.org/officeDocument/2006/relationships" xmlns:m="http://schemas.openxmlformats.org/officeDocument/2006/math" xmlns:v="urn:schemas-microsoft-com:vml" xmlns:wp14="http://schemas.microsoft.com/office/word/2010/wordprocessingDrawing" xmlns:wp="http://schemas.openxmlformats.org/drawingml/2006/wordprocessingDrawing" xmlns:w10="urn:schemas-microsoft-com:office:word" xmlns:w="http://schemas.openxmlformats.org/wordprocessingml/2006/main" xmlns:w14="http://schemas.microsoft.com/office/word/2010/wordml" xmlns:w15="http://schemas.microsoft.com/office/word/2012/wordml" xmlns:w16se="http://schemas.microsoft.com/office/word/2015/wordml/symex" xmlns:wpg="http://schemas.microsoft.com/office/word/2010/wordprocessingGroup" xmlns:wpi="http://schemas.microsoft.com/office/word/2010/wordprocessingInk" xmlns:wne="http://schemas.microsoft.com/office/word/2006/wordml" xmlns:wps="http://schemas.microsoft.com/office/word/2010/wordprocessingShape" mc:Ignorable="w14 w15 w16se wp14">
+<w:document xmlns:wpc="http://schemas.microsoft.com/office/word/2010/wordprocessingCanvas" xmlns:cx="http://schemas.microsoft.com/office/drawing/2014/chartex" xmlns:cx1="http://schemas.microsoft.com/office/drawing/2015/9/8/chartex" xmlns:cx2="http://schemas.microsoft.com/office/drawing/2015/10/21/chartex" xmlns:cx3="http://schemas.microsoft.com/office/drawing/2016/5/9/chartex" xmlns:cx4="http://schemas.microsoft.com/office/drawing/2016/5/10/chartex" xmlns:cx5="http://schemas.microsoft.com/office/drawing/2016/5/11/chartex" xmlns:cx6="http://schemas.microsoft.com/office/drawing/2016/5/12/chartex" xmlns:cx7="http://schemas.microsoft.com/office/drawing/2016/5/13/chartex" xmlns:cx8="http://schemas.microsoft.com/office/drawing/2016/5/14/chartex" xmlns:mc="http://schemas.openxmlformats.org/markup-compatibility/2006" xmlns:aink="http://schemas.microsoft.com/office/drawing/2016/ink" xmlns:am3d="http://schemas.microsoft.com/office/drawing/2017/model3d" xmlns:o="urn:schemas-microsoft-com:office:office" xmlns:oel="http://schemas.microsoft.com/office/2019/extlst" xmlns:r="http://schemas.openxmlformats.org/officeDocument/2006/relationships" xmlns:m="http://schemas.openxmlformats.org/officeDocument/2006/math" xmlns:v="urn:schemas-microsoft-com:vml" xmlns:wp14="http://schemas.microsoft.com/office/word/2010/wordprocessingDrawing" xmlns:wp="http://schemas.openxmlformats.org/drawingml/2006/wordprocessingDrawing" xmlns:w10="urn:schemas-microsoft-com:office:word" xmlns:w="http://schemas.openxmlformats.org/wordprocessingml/2006/main" xmlns:w14="http://schemas.microsoft.com/office/word/2010/wordml" xmlns:w15="http://schemas.microsoft.com/office/word/2012/wordml" xmlns:w16cex="http://schemas.microsoft.com/office/word/2018/wordml/cex" xmlns:w16cid="http://schemas.microsoft.com/office/word/2016/wordml/cid" xmlns:w16="http://schemas.microsoft.com/office/word/2018/wordml" xmlns:w16du="http://schemas.microsoft.com/office/word/2023/wordml/word16du" xmlns:w16sdtdh="http://schemas.microsoft.com/office/word/2020/wordml/sdtdatahash" xmlns:w16sdtfl="http://schemas.microsoft.com/office/word/2024/wordml/sdtformatlock" xmlns:w16se="http://schemas.microsoft.com/office/word/2015/wordml/symex" xmlns:wpg="http://schemas.microsoft.com/office/word/2010/wordprocessingGroup" xmlns:wpi="http://schemas.microsoft.com/office/word/2010/wordprocessingInk" xmlns:wne="http://schemas.microsoft.com/office/word/2006/wordml" xmlns:wps="http://schemas.microsoft.com/office/word/2010/wordprocessingShape" mc:Ignorable="w14 w15 w16se w16cid w16 w16cex w16sdtdh w16sdtfl w16du wp14">
   <w:body>
     <w:p/>
     <w:tbl>
       <w:tblPr>
-        <w:tblStyle w:val="Tablaconcuadrcula"/>
+        <w:tblStyle w:val="TableGrid"/>
         <w:tblW w:w="9923" w:type="dxa"/>
         <w:tblBorders>
           <w:top w:val="none" w:sz="0" w:space="0" w:color="auto"/>
@@ -225,7 +225,7 @@
     </w:p>
     <w:tbl>
       <w:tblPr>
-        <w:tblStyle w:val="Tablaconcuadrcula"/>
+        <w:tblStyle w:val="TableGrid"/>
         <w:tblW w:w="0" w:type="auto"/>
         <w:tblBorders>
           <w:top w:val="single" w:sz="4" w:space="0" w:color="BFBFBF" w:themeColor="background1" w:themeShade="BF"/>
@@ -295,7 +295,7 @@
           </w:p>
           <w:p>
             <w:pPr>
-              <w:pStyle w:val="Prrafodelista"/>
+              <w:pStyle w:val="ListParagraph"/>
               <w:numPr>
                 <w:ilvl w:val="0"/>
                 <w:numId w:val="40"/>
@@ -319,7 +319,7 @@
           </w:p>
           <w:p>
             <w:pPr>
-              <w:pStyle w:val="Prrafodelista"/>
+              <w:pStyle w:val="ListParagraph"/>
               <w:numPr>
                 <w:ilvl w:val="0"/>
                 <w:numId w:val="40"/>
@@ -362,6 +362,15 @@
                 <w:color w:val="1F4E79" w:themeColor="accent1" w:themeShade="80"/>
               </w:rPr>
             </w:pPr>
+            <w:r>
+              <w:rPr>
+                <w:rFonts w:ascii="Calibri" w:hAnsi="Calibri"/>
+                <w:b/>
+                <w:bCs/>
+                <w:color w:val="1F4E79" w:themeColor="accent1" w:themeShade="80"/>
+              </w:rPr>
+              <w:t>Mis intereses profesionales se fortalecieron al momento de realizar el Proyecto APT, debido a que este me ayudó a realizar partes claves del proyecto en la parte del desarrollo del mismo, tanto como la gestión de la base de datos y el desarrollo web.</w:t>
+            </w:r>
           </w:p>
           <w:p>
             <w:pPr>
@@ -436,7 +445,7 @@
     </w:p>
     <w:tbl>
       <w:tblPr>
-        <w:tblStyle w:val="Tablaconcuadrcula"/>
+        <w:tblStyle w:val="TableGrid"/>
         <w:tblW w:w="0" w:type="auto"/>
         <w:tblBorders>
           <w:top w:val="single" w:sz="4" w:space="0" w:color="BFBFBF" w:themeColor="background1" w:themeShade="BF"/>
@@ -506,7 +515,7 @@
           </w:p>
           <w:p>
             <w:pPr>
-              <w:pStyle w:val="Prrafodelista"/>
+              <w:pStyle w:val="ListParagraph"/>
               <w:numPr>
                 <w:ilvl w:val="0"/>
                 <w:numId w:val="40"/>
@@ -530,7 +539,7 @@
           </w:p>
           <w:p>
             <w:pPr>
-              <w:pStyle w:val="Prrafodelista"/>
+              <w:pStyle w:val="ListParagraph"/>
               <w:numPr>
                 <w:ilvl w:val="0"/>
                 <w:numId w:val="40"/>
@@ -554,7 +563,7 @@
           </w:p>
           <w:p>
             <w:pPr>
-              <w:pStyle w:val="Prrafodelista"/>
+              <w:pStyle w:val="ListParagraph"/>
               <w:numPr>
                 <w:ilvl w:val="0"/>
                 <w:numId w:val="40"/>
@@ -599,6 +608,15 @@
                 <w:color w:val="1F4E79" w:themeColor="accent1" w:themeShade="80"/>
               </w:rPr>
             </w:pPr>
+            <w:r>
+              <w:rPr>
+                <w:rFonts w:ascii="Calibri" w:hAnsi="Calibri"/>
+                <w:b/>
+                <w:bCs/>
+                <w:color w:val="1F4E79" w:themeColor="accent1" w:themeShade="80"/>
+              </w:rPr>
+              <w:t>Alguna de mis debilidades han llegado a cambiado, debido a que ahora he descubierto áreas en las cuales no tenia conocimiento y fui aprendiendo a la par del desarrollo, pero podría decir que para poder seguir mejorando mis debilidades debo seguir practicando, realizando distintos proyectos y para seguir fortaleciéndome ayudaría el poder complementarlas con más conocimiento.</w:t>
+            </w:r>
           </w:p>
           <w:p>
             <w:pPr>
@@ -706,7 +724,7 @@
     </w:p>
     <w:tbl>
       <w:tblPr>
-        <w:tblStyle w:val="Tablaconcuadrcula"/>
+        <w:tblStyle w:val="TableGrid"/>
         <w:tblW w:w="0" w:type="auto"/>
         <w:tblBorders>
           <w:top w:val="single" w:sz="4" w:space="0" w:color="BFBFBF" w:themeColor="background1" w:themeShade="BF"/>
@@ -738,15 +756,12 @@
                 <w:szCs w:val="24"/>
               </w:rPr>
             </w:pPr>
-            <w:bookmarkStart w:id="0" w:name="_GoBack"/>
-            <w:bookmarkEnd w:id="0"/>
             <w:r>
               <w:rPr>
                 <w:rFonts w:eastAsiaTheme="majorEastAsia"/>
                 <w:sz w:val="24"/>
                 <w:szCs w:val="24"/>
               </w:rPr>
-              <w:lastRenderedPageBreak/>
               <w:t>3. Mira la pregunta 3 de la Pauta de Reflexión de la Fase I que describe tus proyecciones laborales al inicio de la asignatura y responde:</w:t>
             </w:r>
           </w:p>
@@ -777,7 +792,7 @@
           </w:p>
           <w:p>
             <w:pPr>
-              <w:pStyle w:val="Prrafodelista"/>
+              <w:pStyle w:val="ListParagraph"/>
               <w:numPr>
                 <w:ilvl w:val="0"/>
                 <w:numId w:val="40"/>
@@ -801,7 +816,7 @@
           </w:p>
           <w:p>
             <w:pPr>
-              <w:pStyle w:val="Prrafodelista"/>
+              <w:pStyle w:val="ListParagraph"/>
               <w:numPr>
                 <w:ilvl w:val="0"/>
                 <w:numId w:val="40"/>
@@ -844,6 +859,46 @@
                 <w:color w:val="1F4E79" w:themeColor="accent1" w:themeShade="80"/>
               </w:rPr>
             </w:pPr>
+            <w:r>
+              <w:rPr>
+                <w:rFonts w:ascii="Calibri" w:hAnsi="Calibri"/>
+                <w:b/>
+                <w:bCs/>
+                <w:color w:val="1F4E79" w:themeColor="accent1" w:themeShade="80"/>
+              </w:rPr>
+              <w:t>Mis proyecciones laborales no cambiaron, ya que mi enfoque en el Proyecto APT fueron los mismos que en el ámbito laboral al cual me quiero enfocar, el cual sería el desarrollo y gestión de base de datos.</w:t>
+            </w:r>
+          </w:p>
+          <w:p>
+            <w:pPr>
+              <w:jc w:val="both"/>
+              <w:rPr>
+                <w:rFonts w:ascii="Calibri" w:hAnsi="Calibri"/>
+                <w:b/>
+                <w:bCs/>
+                <w:color w:val="1F4E79" w:themeColor="accent1" w:themeShade="80"/>
+              </w:rPr>
+            </w:pPr>
+          </w:p>
+          <w:p>
+            <w:pPr>
+              <w:jc w:val="both"/>
+              <w:rPr>
+                <w:rFonts w:ascii="Calibri" w:hAnsi="Calibri"/>
+                <w:b/>
+                <w:bCs/>
+                <w:color w:val="1F4E79" w:themeColor="accent1" w:themeShade="80"/>
+              </w:rPr>
+            </w:pPr>
+            <w:r>
+              <w:rPr>
+                <w:rFonts w:ascii="Calibri" w:hAnsi="Calibri"/>
+                <w:b/>
+                <w:bCs/>
+                <w:color w:val="1F4E79" w:themeColor="accent1" w:themeShade="80"/>
+              </w:rPr>
+              <w:t>Me imagino trabajando como consultor para alguna empresa, desarrollando sistemas o ayudando a mejorar sistemas ya creados de antes.</w:t>
+            </w:r>
           </w:p>
           <w:p>
             <w:pPr>
@@ -907,7 +962,7 @@
     </w:p>
     <w:tbl>
       <w:tblPr>
-        <w:tblStyle w:val="Tablaconcuadrcula"/>
+        <w:tblStyle w:val="TableGrid"/>
         <w:tblW w:w="0" w:type="auto"/>
         <w:tblBorders>
           <w:top w:val="single" w:sz="4" w:space="0" w:color="BFBFBF" w:themeColor="background1" w:themeShade="BF"/>
@@ -962,7 +1017,7 @@
           </w:tcPr>
           <w:p>
             <w:pPr>
-              <w:pStyle w:val="Prrafodelista"/>
+              <w:pStyle w:val="ListParagraph"/>
               <w:numPr>
                 <w:ilvl w:val="0"/>
                 <w:numId w:val="40"/>
@@ -986,7 +1041,7 @@
           </w:p>
           <w:p>
             <w:pPr>
-              <w:pStyle w:val="Prrafodelista"/>
+              <w:pStyle w:val="ListParagraph"/>
               <w:numPr>
                 <w:ilvl w:val="0"/>
                 <w:numId w:val="40"/>
@@ -1023,6 +1078,13 @@
                 <w:szCs w:val="24"/>
               </w:rPr>
             </w:pPr>
+            <w:r>
+              <w:rPr>
+                <w:sz w:val="24"/>
+                <w:szCs w:val="24"/>
+              </w:rPr>
+              <w:t>Los mejores aspectos que pude identificar del trabajo en grupo fue la comunicación y el gran compañerismo que se fue creando al momento del desarrollo del proyecto.</w:t>
+            </w:r>
           </w:p>
           <w:p>
             <w:pPr>
@@ -1041,6 +1103,13 @@
                 <w:szCs w:val="24"/>
               </w:rPr>
             </w:pPr>
+            <w:r>
+              <w:rPr>
+                <w:sz w:val="24"/>
+                <w:szCs w:val="24"/>
+              </w:rPr>
+              <w:t>Aspectos a mejorar sería el perder más la vergüenza al momento de querer saber sobre algún tema que llegue a desconocer, aunque ahora mismo no tengo problemas en preguntar, siempre está esa vergüenza, la cual quiero poco a poco ir perdiendo, ya que saber preguntar y como, es algo que aporta muchísimo al momento de estar en algún equipo de trabajo.</w:t>
+            </w:r>
           </w:p>
           <w:p>
             <w:pPr>
@@ -1126,7 +1195,7 @@
 </file>
 
 <file path=word/endnotes.xml><?xml version="1.0" encoding="utf-8"?>
-<w:endnotes xmlns:wpc="http://schemas.microsoft.com/office/word/2010/wordprocessingCanvas" xmlns:cx="http://schemas.microsoft.com/office/drawing/2014/chartex" xmlns:mc="http://schemas.openxmlformats.org/markup-compatibility/2006" xmlns:o="urn:schemas-microsoft-com:office:office" xmlns:r="http://schemas.openxmlformats.org/officeDocument/2006/relationships" xmlns:m="http://schemas.openxmlformats.org/officeDocument/2006/math" xmlns:v="urn:schemas-microsoft-com:vml" xmlns:wp14="http://schemas.microsoft.com/office/word/2010/wordprocessingDrawing" xmlns:wp="http://schemas.openxmlformats.org/drawingml/2006/wordprocessingDrawing" xmlns:w10="urn:schemas-microsoft-com:office:word" xmlns:w="http://schemas.openxmlformats.org/wordprocessingml/2006/main" xmlns:w14="http://schemas.microsoft.com/office/word/2010/wordml" xmlns:w15="http://schemas.microsoft.com/office/word/2012/wordml" xmlns:w16se="http://schemas.microsoft.com/office/word/2015/wordml/symex" xmlns:wpg="http://schemas.microsoft.com/office/word/2010/wordprocessingGroup" xmlns:wpi="http://schemas.microsoft.com/office/word/2010/wordprocessingInk" xmlns:wne="http://schemas.microsoft.com/office/word/2006/wordml" xmlns:wps="http://schemas.microsoft.com/office/word/2010/wordprocessingShape" mc:Ignorable="w14 w15 w16se wp14">
+<w:endnotes xmlns:wpc="http://schemas.microsoft.com/office/word/2010/wordprocessingCanvas" xmlns:cx="http://schemas.microsoft.com/office/drawing/2014/chartex" xmlns:cx1="http://schemas.microsoft.com/office/drawing/2015/9/8/chartex" xmlns:cx2="http://schemas.microsoft.com/office/drawing/2015/10/21/chartex" xmlns:cx3="http://schemas.microsoft.com/office/drawing/2016/5/9/chartex" xmlns:cx4="http://schemas.microsoft.com/office/drawing/2016/5/10/chartex" xmlns:cx5="http://schemas.microsoft.com/office/drawing/2016/5/11/chartex" xmlns:cx6="http://schemas.microsoft.com/office/drawing/2016/5/12/chartex" xmlns:cx7="http://schemas.microsoft.com/office/drawing/2016/5/13/chartex" xmlns:cx8="http://schemas.microsoft.com/office/drawing/2016/5/14/chartex" xmlns:mc="http://schemas.openxmlformats.org/markup-compatibility/2006" xmlns:aink="http://schemas.microsoft.com/office/drawing/2016/ink" xmlns:am3d="http://schemas.microsoft.com/office/drawing/2017/model3d" xmlns:o="urn:schemas-microsoft-com:office:office" xmlns:oel="http://schemas.microsoft.com/office/2019/extlst" xmlns:r="http://schemas.openxmlformats.org/officeDocument/2006/relationships" xmlns:m="http://schemas.openxmlformats.org/officeDocument/2006/math" xmlns:v="urn:schemas-microsoft-com:vml" xmlns:wp14="http://schemas.microsoft.com/office/word/2010/wordprocessingDrawing" xmlns:wp="http://schemas.openxmlformats.org/drawingml/2006/wordprocessingDrawing" xmlns:w10="urn:schemas-microsoft-com:office:word" xmlns:w="http://schemas.openxmlformats.org/wordprocessingml/2006/main" xmlns:w14="http://schemas.microsoft.com/office/word/2010/wordml" xmlns:w15="http://schemas.microsoft.com/office/word/2012/wordml" xmlns:w16cex="http://schemas.microsoft.com/office/word/2018/wordml/cex" xmlns:w16cid="http://schemas.microsoft.com/office/word/2016/wordml/cid" xmlns:w16="http://schemas.microsoft.com/office/word/2018/wordml" xmlns:w16du="http://schemas.microsoft.com/office/word/2023/wordml/word16du" xmlns:w16sdtdh="http://schemas.microsoft.com/office/word/2020/wordml/sdtdatahash" xmlns:w16sdtfl="http://schemas.microsoft.com/office/word/2024/wordml/sdtformatlock" xmlns:w16se="http://schemas.microsoft.com/office/word/2015/wordml/symex" xmlns:wpg="http://schemas.microsoft.com/office/word/2010/wordprocessingGroup" xmlns:wpi="http://schemas.microsoft.com/office/word/2010/wordprocessingInk" xmlns:wne="http://schemas.microsoft.com/office/word/2006/wordml" xmlns:wps="http://schemas.microsoft.com/office/word/2010/wordprocessingShape" mc:Ignorable="w14 w15 w16se w16cid w16 w16cex w16sdtdh w16sdtfl w16du wp14">
   <w:endnote w:type="separator" w:id="-1">
     <w:p>
       <w:pPr>
@@ -1151,7 +1220,7 @@
 </file>
 
 <file path=word/footer1.xml><?xml version="1.0" encoding="utf-8"?>
-<w:ftr xmlns:wpc="http://schemas.microsoft.com/office/word/2010/wordprocessingCanvas" xmlns:cx="http://schemas.microsoft.com/office/drawing/2014/chartex" xmlns:mc="http://schemas.openxmlformats.org/markup-compatibility/2006" xmlns:o="urn:schemas-microsoft-com:office:office" xmlns:r="http://schemas.openxmlformats.org/officeDocument/2006/relationships" xmlns:m="http://schemas.openxmlformats.org/officeDocument/2006/math" xmlns:v="urn:schemas-microsoft-com:vml" xmlns:wp14="http://schemas.microsoft.com/office/word/2010/wordprocessingDrawing" xmlns:wp="http://schemas.openxmlformats.org/drawingml/2006/wordprocessingDrawing" xmlns:w10="urn:schemas-microsoft-com:office:word" xmlns:w="http://schemas.openxmlformats.org/wordprocessingml/2006/main" xmlns:w14="http://schemas.microsoft.com/office/word/2010/wordml" xmlns:w15="http://schemas.microsoft.com/office/word/2012/wordml" xmlns:w16se="http://schemas.microsoft.com/office/word/2015/wordml/symex" xmlns:wpg="http://schemas.microsoft.com/office/word/2010/wordprocessingGroup" xmlns:wpi="http://schemas.microsoft.com/office/word/2010/wordprocessingInk" xmlns:wne="http://schemas.microsoft.com/office/word/2006/wordml" xmlns:wps="http://schemas.microsoft.com/office/word/2010/wordprocessingShape" mc:Ignorable="w14 w15 w16se wp14">
+<w:ftr xmlns:wpc="http://schemas.microsoft.com/office/word/2010/wordprocessingCanvas" xmlns:cx="http://schemas.microsoft.com/office/drawing/2014/chartex" xmlns:cx1="http://schemas.microsoft.com/office/drawing/2015/9/8/chartex" xmlns:cx2="http://schemas.microsoft.com/office/drawing/2015/10/21/chartex" xmlns:cx3="http://schemas.microsoft.com/office/drawing/2016/5/9/chartex" xmlns:cx4="http://schemas.microsoft.com/office/drawing/2016/5/10/chartex" xmlns:cx5="http://schemas.microsoft.com/office/drawing/2016/5/11/chartex" xmlns:cx6="http://schemas.microsoft.com/office/drawing/2016/5/12/chartex" xmlns:cx7="http://schemas.microsoft.com/office/drawing/2016/5/13/chartex" xmlns:cx8="http://schemas.microsoft.com/office/drawing/2016/5/14/chartex" xmlns:mc="http://schemas.openxmlformats.org/markup-compatibility/2006" xmlns:aink="http://schemas.microsoft.com/office/drawing/2016/ink" xmlns:am3d="http://schemas.microsoft.com/office/drawing/2017/model3d" xmlns:o="urn:schemas-microsoft-com:office:office" xmlns:oel="http://schemas.microsoft.com/office/2019/extlst" xmlns:r="http://schemas.openxmlformats.org/officeDocument/2006/relationships" xmlns:m="http://schemas.openxmlformats.org/officeDocument/2006/math" xmlns:v="urn:schemas-microsoft-com:vml" xmlns:wp14="http://schemas.microsoft.com/office/word/2010/wordprocessingDrawing" xmlns:wp="http://schemas.openxmlformats.org/drawingml/2006/wordprocessingDrawing" xmlns:w10="urn:schemas-microsoft-com:office:word" xmlns:w="http://schemas.openxmlformats.org/wordprocessingml/2006/main" xmlns:w14="http://schemas.microsoft.com/office/word/2010/wordml" xmlns:w15="http://schemas.microsoft.com/office/word/2012/wordml" xmlns:w16cex="http://schemas.microsoft.com/office/word/2018/wordml/cex" xmlns:w16cid="http://schemas.microsoft.com/office/word/2016/wordml/cid" xmlns:w16="http://schemas.microsoft.com/office/word/2018/wordml" xmlns:w16du="http://schemas.microsoft.com/office/word/2023/wordml/word16du" xmlns:w16sdtdh="http://schemas.microsoft.com/office/word/2020/wordml/sdtdatahash" xmlns:w16sdtfl="http://schemas.microsoft.com/office/word/2024/wordml/sdtformatlock" xmlns:w16se="http://schemas.microsoft.com/office/word/2015/wordml/symex" xmlns:wpg="http://schemas.microsoft.com/office/word/2010/wordprocessingGroup" xmlns:wpi="http://schemas.microsoft.com/office/word/2010/wordprocessingInk" xmlns:wne="http://schemas.microsoft.com/office/word/2006/wordml" xmlns:wps="http://schemas.microsoft.com/office/word/2010/wordprocessingShape" mc:Ignorable="w14 w15 w16se w16cid w16 w16cex w16sdtdh w16sdtfl w16du wp14">
   <w:sdt>
     <w:sdtPr>
       <w:id w:val="-937982979"/>
@@ -1160,11 +1229,10 @@
         <w:docPartUnique/>
       </w:docPartObj>
     </w:sdtPr>
-    <w:sdtEndPr/>
     <w:sdtContent>
       <w:p>
         <w:pPr>
-          <w:pStyle w:val="Piedepgina"/>
+          <w:pStyle w:val="Footer"/>
         </w:pPr>
         <w:r>
           <w:rPr>
@@ -1372,7 +1440,7 @@
             </mc:Choice>
             <mc:Fallback>
               <w:pict>
-                <v:group w14:anchorId="51D00065" id="Grupo 32" o:spid="_x0000_s1026" style="position:absolute;margin-left:0;margin-top:0;width:610.5pt;height:15pt;z-index:251659264;mso-width-percent:1000;mso-position-horizontal:center;mso-position-horizontal-relative:page;mso-position-vertical:center;mso-position-vertical-relative:bottom-margin-area;mso-width-percent:1000" coordorigin=",14970" coordsize="12255,300" o:gfxdata="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">
+                <v:group w14:anchorId="51D00065" id="Grupo 32" o:spid="_x0000_s1026" style="position:absolute;margin-left:0;margin-top:0;width:610.5pt;height:15pt;z-index:251659264;mso-width-percent:1000;mso-position-horizontal:center;mso-position-horizontal-relative:page;mso-position-vertical:center;mso-position-vertical-relative:bottom-margin-area;mso-width-percent:1000" coordorigin=",14970" coordsize="12255,300" o:gfxdata="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">
                   <v:shapetype id="_x0000_t202" coordsize="21600,21600" o:spt="202" path="m,l,21600r21600,l21600,xe">
                     <v:stroke joinstyle="miter"/>
                     <v:path gradientshapeok="t" o:connecttype="rect"/>
@@ -1439,7 +1507,7 @@
 </file>
 
 <file path=word/footnotes.xml><?xml version="1.0" encoding="utf-8"?>
-<w:footnotes xmlns:wpc="http://schemas.microsoft.com/office/word/2010/wordprocessingCanvas" xmlns:cx="http://schemas.microsoft.com/office/drawing/2014/chartex" xmlns:mc="http://schemas.openxmlformats.org/markup-compatibility/2006" xmlns:o="urn:schemas-microsoft-com:office:office" xmlns:r="http://schemas.openxmlformats.org/officeDocument/2006/relationships" xmlns:m="http://schemas.openxmlformats.org/officeDocument/2006/math" xmlns:v="urn:schemas-microsoft-com:vml" xmlns:wp14="http://schemas.microsoft.com/office/word/2010/wordprocessingDrawing" xmlns:wp="http://schemas.openxmlformats.org/drawingml/2006/wordprocessingDrawing" xmlns:w10="urn:schemas-microsoft-com:office:word" xmlns:w="http://schemas.openxmlformats.org/wordprocessingml/2006/main" xmlns:w14="http://schemas.microsoft.com/office/word/2010/wordml" xmlns:w15="http://schemas.microsoft.com/office/word/2012/wordml" xmlns:w16se="http://schemas.microsoft.com/office/word/2015/wordml/symex" xmlns:wpg="http://schemas.microsoft.com/office/word/2010/wordprocessingGroup" xmlns:wpi="http://schemas.microsoft.com/office/word/2010/wordprocessingInk" xmlns:wne="http://schemas.microsoft.com/office/word/2006/wordml" xmlns:wps="http://schemas.microsoft.com/office/word/2010/wordprocessingShape" mc:Ignorable="w14 w15 w16se wp14">
+<w:footnotes xmlns:wpc="http://schemas.microsoft.com/office/word/2010/wordprocessingCanvas" xmlns:cx="http://schemas.microsoft.com/office/drawing/2014/chartex" xmlns:cx1="http://schemas.microsoft.com/office/drawing/2015/9/8/chartex" xmlns:cx2="http://schemas.microsoft.com/office/drawing/2015/10/21/chartex" xmlns:cx3="http://schemas.microsoft.com/office/drawing/2016/5/9/chartex" xmlns:cx4="http://schemas.microsoft.com/office/drawing/2016/5/10/chartex" xmlns:cx5="http://schemas.microsoft.com/office/drawing/2016/5/11/chartex" xmlns:cx6="http://schemas.microsoft.com/office/drawing/2016/5/12/chartex" xmlns:cx7="http://schemas.microsoft.com/office/drawing/2016/5/13/chartex" xmlns:cx8="http://schemas.microsoft.com/office/drawing/2016/5/14/chartex" xmlns:mc="http://schemas.openxmlformats.org/markup-compatibility/2006" xmlns:aink="http://schemas.microsoft.com/office/drawing/2016/ink" xmlns:am3d="http://schemas.microsoft.com/office/drawing/2017/model3d" xmlns:o="urn:schemas-microsoft-com:office:office" xmlns:oel="http://schemas.microsoft.com/office/2019/extlst" xmlns:r="http://schemas.openxmlformats.org/officeDocument/2006/relationships" xmlns:m="http://schemas.openxmlformats.org/officeDocument/2006/math" xmlns:v="urn:schemas-microsoft-com:vml" xmlns:wp14="http://schemas.microsoft.com/office/word/2010/wordprocessingDrawing" xmlns:wp="http://schemas.openxmlformats.org/drawingml/2006/wordprocessingDrawing" xmlns:w10="urn:schemas-microsoft-com:office:word" xmlns:w="http://schemas.openxmlformats.org/wordprocessingml/2006/main" xmlns:w14="http://schemas.microsoft.com/office/word/2010/wordml" xmlns:w15="http://schemas.microsoft.com/office/word/2012/wordml" xmlns:w16cex="http://schemas.microsoft.com/office/word/2018/wordml/cex" xmlns:w16cid="http://schemas.microsoft.com/office/word/2016/wordml/cid" xmlns:w16="http://schemas.microsoft.com/office/word/2018/wordml" xmlns:w16du="http://schemas.microsoft.com/office/word/2023/wordml/word16du" xmlns:w16sdtdh="http://schemas.microsoft.com/office/word/2020/wordml/sdtdatahash" xmlns:w16sdtfl="http://schemas.microsoft.com/office/word/2024/wordml/sdtformatlock" xmlns:w16se="http://schemas.microsoft.com/office/word/2015/wordml/symex" xmlns:wpg="http://schemas.microsoft.com/office/word/2010/wordprocessingGroup" xmlns:wpi="http://schemas.microsoft.com/office/word/2010/wordprocessingInk" xmlns:wne="http://schemas.microsoft.com/office/word/2006/wordml" xmlns:wps="http://schemas.microsoft.com/office/word/2010/wordprocessingShape" mc:Ignorable="w14 w15 w16se w16cid w16 w16cex w16sdtdh w16sdtfl w16du wp14">
   <w:footnote w:type="separator" w:id="-1">
     <w:p>
       <w:pPr>
@@ -1464,10 +1532,10 @@
 </file>
 
 <file path=word/header1.xml><?xml version="1.0" encoding="utf-8"?>
-<w:hdr xmlns:wpc="http://schemas.microsoft.com/office/word/2010/wordprocessingCanvas" xmlns:cx="http://schemas.microsoft.com/office/drawing/2014/chartex" xmlns:mc="http://schemas.openxmlformats.org/markup-compatibility/2006" xmlns:o="urn:schemas-microsoft-com:office:office" xmlns:r="http://schemas.openxmlformats.org/officeDocument/2006/relationships" xmlns:m="http://schemas.openxmlformats.org/officeDocument/2006/math" xmlns:v="urn:schemas-microsoft-com:vml" xmlns:wp14="http://schemas.microsoft.com/office/word/2010/wordprocessingDrawing" xmlns:wp="http://schemas.openxmlformats.org/drawingml/2006/wordprocessingDrawing" xmlns:w10="urn:schemas-microsoft-com:office:word" xmlns:w="http://schemas.openxmlformats.org/wordprocessingml/2006/main" xmlns:w14="http://schemas.microsoft.com/office/word/2010/wordml" xmlns:w15="http://schemas.microsoft.com/office/word/2012/wordml" xmlns:w16se="http://schemas.microsoft.com/office/word/2015/wordml/symex" xmlns:wpg="http://schemas.microsoft.com/office/word/2010/wordprocessingGroup" xmlns:wpi="http://schemas.microsoft.com/office/word/2010/wordprocessingInk" xmlns:wne="http://schemas.microsoft.com/office/word/2006/wordml" xmlns:wps="http://schemas.microsoft.com/office/word/2010/wordprocessingShape" mc:Ignorable="w14 w15 w16se wp14">
+<w:hdr xmlns:wpc="http://schemas.microsoft.com/office/word/2010/wordprocessingCanvas" xmlns:cx="http://schemas.microsoft.com/office/drawing/2014/chartex" xmlns:cx1="http://schemas.microsoft.com/office/drawing/2015/9/8/chartex" xmlns:cx2="http://schemas.microsoft.com/office/drawing/2015/10/21/chartex" xmlns:cx3="http://schemas.microsoft.com/office/drawing/2016/5/9/chartex" xmlns:cx4="http://schemas.microsoft.com/office/drawing/2016/5/10/chartex" xmlns:cx5="http://schemas.microsoft.com/office/drawing/2016/5/11/chartex" xmlns:cx6="http://schemas.microsoft.com/office/drawing/2016/5/12/chartex" xmlns:cx7="http://schemas.microsoft.com/office/drawing/2016/5/13/chartex" xmlns:cx8="http://schemas.microsoft.com/office/drawing/2016/5/14/chartex" xmlns:mc="http://schemas.openxmlformats.org/markup-compatibility/2006" xmlns:aink="http://schemas.microsoft.com/office/drawing/2016/ink" xmlns:am3d="http://schemas.microsoft.com/office/drawing/2017/model3d" xmlns:o="urn:schemas-microsoft-com:office:office" xmlns:oel="http://schemas.microsoft.com/office/2019/extlst" xmlns:r="http://schemas.openxmlformats.org/officeDocument/2006/relationships" xmlns:m="http://schemas.openxmlformats.org/officeDocument/2006/math" xmlns:v="urn:schemas-microsoft-com:vml" xmlns:wp14="http://schemas.microsoft.com/office/word/2010/wordprocessingDrawing" xmlns:wp="http://schemas.openxmlformats.org/drawingml/2006/wordprocessingDrawing" xmlns:w10="urn:schemas-microsoft-com:office:word" xmlns:w="http://schemas.openxmlformats.org/wordprocessingml/2006/main" xmlns:w14="http://schemas.microsoft.com/office/word/2010/wordml" xmlns:w15="http://schemas.microsoft.com/office/word/2012/wordml" xmlns:w16cex="http://schemas.microsoft.com/office/word/2018/wordml/cex" xmlns:w16cid="http://schemas.microsoft.com/office/word/2016/wordml/cid" xmlns:w16="http://schemas.microsoft.com/office/word/2018/wordml" xmlns:w16du="http://schemas.microsoft.com/office/word/2023/wordml/word16du" xmlns:w16sdtdh="http://schemas.microsoft.com/office/word/2020/wordml/sdtdatahash" xmlns:w16sdtfl="http://schemas.microsoft.com/office/word/2024/wordml/sdtformatlock" xmlns:w16se="http://schemas.microsoft.com/office/word/2015/wordml/symex" xmlns:wpg="http://schemas.microsoft.com/office/word/2010/wordprocessingGroup" xmlns:wpi="http://schemas.microsoft.com/office/word/2010/wordprocessingInk" xmlns:wne="http://schemas.microsoft.com/office/word/2006/wordml" xmlns:wps="http://schemas.microsoft.com/office/word/2010/wordprocessingShape" mc:Ignorable="w14 w15 w16se w16cid w16 w16cex w16sdtdh w16sdtfl w16du wp14">
   <w:tbl>
     <w:tblPr>
-      <w:tblStyle w:val="Tablaconcuadrcula"/>
+      <w:tblStyle w:val="TableGrid"/>
       <w:tblW w:w="9923" w:type="dxa"/>
       <w:tblLook w:val="04A0" w:firstRow="1" w:lastRow="0" w:firstColumn="1" w:lastColumn="0" w:noHBand="0" w:noVBand="1"/>
     </w:tblPr>
@@ -1619,7 +1687,7 @@
   </w:tbl>
   <w:p>
     <w:pPr>
-      <w:pStyle w:val="Encabezado"/>
+      <w:pStyle w:val="Header"/>
       <w:tabs>
         <w:tab w:val="clear" w:pos="4419"/>
         <w:tab w:val="clear" w:pos="8838"/>
@@ -1634,10 +1702,10 @@
 </file>
 
 <file path=word/header2.xml><?xml version="1.0" encoding="utf-8"?>
-<w:hdr xmlns:wpc="http://schemas.microsoft.com/office/word/2010/wordprocessingCanvas" xmlns:cx="http://schemas.microsoft.com/office/drawing/2014/chartex" xmlns:mc="http://schemas.openxmlformats.org/markup-compatibility/2006" xmlns:o="urn:schemas-microsoft-com:office:office" xmlns:r="http://schemas.openxmlformats.org/officeDocument/2006/relationships" xmlns:m="http://schemas.openxmlformats.org/officeDocument/2006/math" xmlns:v="urn:schemas-microsoft-com:vml" xmlns:wp14="http://schemas.microsoft.com/office/word/2010/wordprocessingDrawing" xmlns:wp="http://schemas.openxmlformats.org/drawingml/2006/wordprocessingDrawing" xmlns:w10="urn:schemas-microsoft-com:office:word" xmlns:w="http://schemas.openxmlformats.org/wordprocessingml/2006/main" xmlns:w14="http://schemas.microsoft.com/office/word/2010/wordml" xmlns:w15="http://schemas.microsoft.com/office/word/2012/wordml" xmlns:w16se="http://schemas.microsoft.com/office/word/2015/wordml/symex" xmlns:wpg="http://schemas.microsoft.com/office/word/2010/wordprocessingGroup" xmlns:wpi="http://schemas.microsoft.com/office/word/2010/wordprocessingInk" xmlns:wne="http://schemas.microsoft.com/office/word/2006/wordml" xmlns:wps="http://schemas.microsoft.com/office/word/2010/wordprocessingShape" mc:Ignorable="w14 w15 w16se wp14">
+<w:hdr xmlns:wpc="http://schemas.microsoft.com/office/word/2010/wordprocessingCanvas" xmlns:cx="http://schemas.microsoft.com/office/drawing/2014/chartex" xmlns:cx1="http://schemas.microsoft.com/office/drawing/2015/9/8/chartex" xmlns:cx2="http://schemas.microsoft.com/office/drawing/2015/10/21/chartex" xmlns:cx3="http://schemas.microsoft.com/office/drawing/2016/5/9/chartex" xmlns:cx4="http://schemas.microsoft.com/office/drawing/2016/5/10/chartex" xmlns:cx5="http://schemas.microsoft.com/office/drawing/2016/5/11/chartex" xmlns:cx6="http://schemas.microsoft.com/office/drawing/2016/5/12/chartex" xmlns:cx7="http://schemas.microsoft.com/office/drawing/2016/5/13/chartex" xmlns:cx8="http://schemas.microsoft.com/office/drawing/2016/5/14/chartex" xmlns:mc="http://schemas.openxmlformats.org/markup-compatibility/2006" xmlns:aink="http://schemas.microsoft.com/office/drawing/2016/ink" xmlns:am3d="http://schemas.microsoft.com/office/drawing/2017/model3d" xmlns:o="urn:schemas-microsoft-com:office:office" xmlns:oel="http://schemas.microsoft.com/office/2019/extlst" xmlns:r="http://schemas.openxmlformats.org/officeDocument/2006/relationships" xmlns:m="http://schemas.openxmlformats.org/officeDocument/2006/math" xmlns:v="urn:schemas-microsoft-com:vml" xmlns:wp14="http://schemas.microsoft.com/office/word/2010/wordprocessingDrawing" xmlns:wp="http://schemas.openxmlformats.org/drawingml/2006/wordprocessingDrawing" xmlns:w10="urn:schemas-microsoft-com:office:word" xmlns:w="http://schemas.openxmlformats.org/wordprocessingml/2006/main" xmlns:w14="http://schemas.microsoft.com/office/word/2010/wordml" xmlns:w15="http://schemas.microsoft.com/office/word/2012/wordml" xmlns:w16cex="http://schemas.microsoft.com/office/word/2018/wordml/cex" xmlns:w16cid="http://schemas.microsoft.com/office/word/2016/wordml/cid" xmlns:w16="http://schemas.microsoft.com/office/word/2018/wordml" xmlns:w16du="http://schemas.microsoft.com/office/word/2023/wordml/word16du" xmlns:w16sdtdh="http://schemas.microsoft.com/office/word/2020/wordml/sdtdatahash" xmlns:w16sdtfl="http://schemas.microsoft.com/office/word/2024/wordml/sdtformatlock" xmlns:w16se="http://schemas.microsoft.com/office/word/2015/wordml/symex" xmlns:wpg="http://schemas.microsoft.com/office/word/2010/wordprocessingGroup" xmlns:wpi="http://schemas.microsoft.com/office/word/2010/wordprocessingInk" xmlns:wne="http://schemas.microsoft.com/office/word/2006/wordml" xmlns:wps="http://schemas.microsoft.com/office/word/2010/wordprocessingShape" mc:Ignorable="w14 w15 w16se w16cid w16 w16cex w16sdtdh w16sdtfl w16du wp14">
   <w:tbl>
     <w:tblPr>
-      <w:tblStyle w:val="Tablaconcuadrcula"/>
+      <w:tblStyle w:val="TableGrid"/>
       <w:tblW w:w="0" w:type="auto"/>
       <w:tblLook w:val="04A0" w:firstRow="1" w:lastRow="0" w:firstColumn="1" w:lastColumn="0" w:noHBand="0" w:noVBand="1"/>
     </w:tblPr>
@@ -1909,7 +1977,7 @@
   </w:tbl>
   <w:p>
     <w:pPr>
-      <w:pStyle w:val="Encabezado"/>
+      <w:pStyle w:val="Header"/>
       <w:jc w:val="right"/>
     </w:pPr>
   </w:p>
@@ -1917,7 +1985,7 @@
 </file>
 
 <file path=word/numbering.xml><?xml version="1.0" encoding="utf-8"?>
-<w:numbering xmlns:wpc="http://schemas.microsoft.com/office/word/2010/wordprocessingCanvas" xmlns:cx="http://schemas.microsoft.com/office/drawing/2014/chartex" xmlns:mc="http://schemas.openxmlformats.org/markup-compatibility/2006" xmlns:o="urn:schemas-microsoft-com:office:office" xmlns:r="http://schemas.openxmlformats.org/officeDocument/2006/relationships" xmlns:m="http://schemas.openxmlformats.org/officeDocument/2006/math" xmlns:v="urn:schemas-microsoft-com:vml" xmlns:wp14="http://schemas.microsoft.com/office/word/2010/wordprocessingDrawing" xmlns:wp="http://schemas.openxmlformats.org/drawingml/2006/wordprocessingDrawing" xmlns:w10="urn:schemas-microsoft-com:office:word" xmlns:w="http://schemas.openxmlformats.org/wordprocessingml/2006/main" xmlns:w14="http://schemas.microsoft.com/office/word/2010/wordml" xmlns:w15="http://schemas.microsoft.com/office/word/2012/wordml" xmlns:w16se="http://schemas.microsoft.com/office/word/2015/wordml/symex" xmlns:wpg="http://schemas.microsoft.com/office/word/2010/wordprocessingGroup" xmlns:wpi="http://schemas.microsoft.com/office/word/2010/wordprocessingInk" xmlns:wne="http://schemas.microsoft.com/office/word/2006/wordml" xmlns:wps="http://schemas.microsoft.com/office/word/2010/wordprocessingShape" mc:Ignorable="w14 w15 w16se wp14">
+<w:numbering xmlns:wpc="http://schemas.microsoft.com/office/word/2010/wordprocessingCanvas" xmlns:cx="http://schemas.microsoft.com/office/drawing/2014/chartex" xmlns:cx1="http://schemas.microsoft.com/office/drawing/2015/9/8/chartex" xmlns:cx2="http://schemas.microsoft.com/office/drawing/2015/10/21/chartex" xmlns:cx3="http://schemas.microsoft.com/office/drawing/2016/5/9/chartex" xmlns:cx4="http://schemas.microsoft.com/office/drawing/2016/5/10/chartex" xmlns:cx5="http://schemas.microsoft.com/office/drawing/2016/5/11/chartex" xmlns:cx6="http://schemas.microsoft.com/office/drawing/2016/5/12/chartex" xmlns:cx7="http://schemas.microsoft.com/office/drawing/2016/5/13/chartex" xmlns:cx8="http://schemas.microsoft.com/office/drawing/2016/5/14/chartex" xmlns:mc="http://schemas.openxmlformats.org/markup-compatibility/2006" xmlns:aink="http://schemas.microsoft.com/office/drawing/2016/ink" xmlns:am3d="http://schemas.microsoft.com/office/drawing/2017/model3d" xmlns:o="urn:schemas-microsoft-com:office:office" xmlns:oel="http://schemas.microsoft.com/office/2019/extlst" xmlns:r="http://schemas.openxmlformats.org/officeDocument/2006/relationships" xmlns:m="http://schemas.openxmlformats.org/officeDocument/2006/math" xmlns:v="urn:schemas-microsoft-com:vml" xmlns:wp14="http://schemas.microsoft.com/office/word/2010/wordprocessingDrawing" xmlns:wp="http://schemas.openxmlformats.org/drawingml/2006/wordprocessingDrawing" xmlns:w10="urn:schemas-microsoft-com:office:word" xmlns:w="http://schemas.openxmlformats.org/wordprocessingml/2006/main" xmlns:w14="http://schemas.microsoft.com/office/word/2010/wordml" xmlns:w15="http://schemas.microsoft.com/office/word/2012/wordml" xmlns:w16cex="http://schemas.microsoft.com/office/word/2018/wordml/cex" xmlns:w16cid="http://schemas.microsoft.com/office/word/2016/wordml/cid" xmlns:w16="http://schemas.microsoft.com/office/word/2018/wordml" xmlns:w16du="http://schemas.microsoft.com/office/word/2023/wordml/word16du" xmlns:w16sdtdh="http://schemas.microsoft.com/office/word/2020/wordml/sdtdatahash" xmlns:w16sdtfl="http://schemas.microsoft.com/office/word/2024/wordml/sdtformatlock" xmlns:w16se="http://schemas.microsoft.com/office/word/2015/wordml/symex" xmlns:wpg="http://schemas.microsoft.com/office/word/2010/wordprocessingGroup" xmlns:wpi="http://schemas.microsoft.com/office/word/2010/wordprocessingInk" xmlns:wne="http://schemas.microsoft.com/office/word/2006/wordml" xmlns:wps="http://schemas.microsoft.com/office/word/2010/wordprocessingShape" mc:Ignorable="w14 w15 w16se w16cid w16 w16cex w16sdtdh w16sdtfl w16du wp14">
   <w:abstractNum w:abstractNumId="0" w15:restartNumberingAfterBreak="0">
     <w:nsid w:val="049156A1"/>
     <w:multiLevelType w:val="hybridMultilevel"/>
@@ -6491,124 +6559,124 @@
       </w:rPr>
     </w:lvl>
   </w:abstractNum>
-  <w:num w:numId="1">
+  <w:num w:numId="1" w16cid:durableId="99567771">
     <w:abstractNumId w:val="3"/>
   </w:num>
-  <w:num w:numId="2">
+  <w:num w:numId="2" w16cid:durableId="1893418252">
     <w:abstractNumId w:val="8"/>
   </w:num>
-  <w:num w:numId="3">
+  <w:num w:numId="3" w16cid:durableId="1227107452">
     <w:abstractNumId w:val="12"/>
   </w:num>
-  <w:num w:numId="4">
+  <w:num w:numId="4" w16cid:durableId="756944703">
     <w:abstractNumId w:val="28"/>
   </w:num>
-  <w:num w:numId="5">
+  <w:num w:numId="5" w16cid:durableId="496919562">
     <w:abstractNumId w:val="30"/>
   </w:num>
-  <w:num w:numId="6">
+  <w:num w:numId="6" w16cid:durableId="389350193">
     <w:abstractNumId w:val="4"/>
   </w:num>
-  <w:num w:numId="7">
+  <w:num w:numId="7" w16cid:durableId="306202168">
     <w:abstractNumId w:val="11"/>
   </w:num>
-  <w:num w:numId="8">
+  <w:num w:numId="8" w16cid:durableId="223026298">
     <w:abstractNumId w:val="19"/>
   </w:num>
-  <w:num w:numId="9">
+  <w:num w:numId="9" w16cid:durableId="392892378">
     <w:abstractNumId w:val="15"/>
   </w:num>
-  <w:num w:numId="10">
+  <w:num w:numId="10" w16cid:durableId="1468742718">
     <w:abstractNumId w:val="9"/>
   </w:num>
-  <w:num w:numId="11">
+  <w:num w:numId="11" w16cid:durableId="1002052714">
     <w:abstractNumId w:val="24"/>
   </w:num>
-  <w:num w:numId="12">
+  <w:num w:numId="12" w16cid:durableId="984234320">
     <w:abstractNumId w:val="35"/>
   </w:num>
-  <w:num w:numId="13">
+  <w:num w:numId="13" w16cid:durableId="457532688">
     <w:abstractNumId w:val="29"/>
   </w:num>
-  <w:num w:numId="14">
+  <w:num w:numId="14" w16cid:durableId="1673945393">
     <w:abstractNumId w:val="1"/>
   </w:num>
-  <w:num w:numId="15">
+  <w:num w:numId="15" w16cid:durableId="1573664549">
     <w:abstractNumId w:val="36"/>
   </w:num>
-  <w:num w:numId="16">
+  <w:num w:numId="16" w16cid:durableId="590087155">
     <w:abstractNumId w:val="21"/>
   </w:num>
-  <w:num w:numId="17">
+  <w:num w:numId="17" w16cid:durableId="120464214">
     <w:abstractNumId w:val="17"/>
   </w:num>
-  <w:num w:numId="18">
+  <w:num w:numId="18" w16cid:durableId="227420921">
     <w:abstractNumId w:val="31"/>
   </w:num>
-  <w:num w:numId="19">
+  <w:num w:numId="19" w16cid:durableId="1159887208">
     <w:abstractNumId w:val="10"/>
   </w:num>
-  <w:num w:numId="20">
+  <w:num w:numId="20" w16cid:durableId="1797525826">
     <w:abstractNumId w:val="39"/>
   </w:num>
-  <w:num w:numId="21">
+  <w:num w:numId="21" w16cid:durableId="783379254">
     <w:abstractNumId w:val="34"/>
   </w:num>
-  <w:num w:numId="22">
+  <w:num w:numId="22" w16cid:durableId="1040327358">
     <w:abstractNumId w:val="13"/>
   </w:num>
-  <w:num w:numId="23">
+  <w:num w:numId="23" w16cid:durableId="171914734">
     <w:abstractNumId w:val="14"/>
   </w:num>
-  <w:num w:numId="24">
+  <w:num w:numId="24" w16cid:durableId="337997978">
     <w:abstractNumId w:val="5"/>
   </w:num>
-  <w:num w:numId="25">
+  <w:num w:numId="25" w16cid:durableId="211382033">
     <w:abstractNumId w:val="16"/>
   </w:num>
-  <w:num w:numId="26">
+  <w:num w:numId="26" w16cid:durableId="1028411629">
     <w:abstractNumId w:val="20"/>
   </w:num>
-  <w:num w:numId="27">
+  <w:num w:numId="27" w16cid:durableId="1535264424">
     <w:abstractNumId w:val="23"/>
   </w:num>
-  <w:num w:numId="28">
+  <w:num w:numId="28" w16cid:durableId="1363632073">
     <w:abstractNumId w:val="0"/>
   </w:num>
-  <w:num w:numId="29">
+  <w:num w:numId="29" w16cid:durableId="872763901">
     <w:abstractNumId w:val="18"/>
   </w:num>
-  <w:num w:numId="30">
+  <w:num w:numId="30" w16cid:durableId="1517845436">
     <w:abstractNumId w:val="22"/>
   </w:num>
-  <w:num w:numId="31">
+  <w:num w:numId="31" w16cid:durableId="476268136">
     <w:abstractNumId w:val="2"/>
   </w:num>
-  <w:num w:numId="32">
+  <w:num w:numId="32" w16cid:durableId="1651054617">
     <w:abstractNumId w:val="7"/>
   </w:num>
-  <w:num w:numId="33">
+  <w:num w:numId="33" w16cid:durableId="2125617067">
     <w:abstractNumId w:val="32"/>
   </w:num>
-  <w:num w:numId="34">
+  <w:num w:numId="34" w16cid:durableId="743717705">
     <w:abstractNumId w:val="38"/>
   </w:num>
-  <w:num w:numId="35">
+  <w:num w:numId="35" w16cid:durableId="1734810685">
     <w:abstractNumId w:val="6"/>
   </w:num>
-  <w:num w:numId="36">
+  <w:num w:numId="36" w16cid:durableId="1752191661">
     <w:abstractNumId w:val="25"/>
   </w:num>
-  <w:num w:numId="37">
+  <w:num w:numId="37" w16cid:durableId="615449545">
     <w:abstractNumId w:val="37"/>
   </w:num>
-  <w:num w:numId="38">
+  <w:num w:numId="38" w16cid:durableId="379743177">
     <w:abstractNumId w:val="27"/>
   </w:num>
-  <w:num w:numId="39">
+  <w:num w:numId="39" w16cid:durableId="977883977">
     <w:abstractNumId w:val="26"/>
   </w:num>
-  <w:num w:numId="40">
+  <w:num w:numId="40" w16cid:durableId="1406730682">
     <w:abstractNumId w:val="33"/>
   </w:num>
   <w:numIdMacAtCleanup w:val="18"/>
@@ -6616,7 +6684,7 @@
 </file>
 
 <file path=word/styles.xml><?xml version="1.0" encoding="utf-8"?>
-<w:styles xmlns:mc="http://schemas.openxmlformats.org/markup-compatibility/2006" xmlns:r="http://schemas.openxmlformats.org/officeDocument/2006/relationships" xmlns:w="http://schemas.openxmlformats.org/wordprocessingml/2006/main" xmlns:w14="http://schemas.microsoft.com/office/word/2010/wordml" xmlns:w15="http://schemas.microsoft.com/office/word/2012/wordml" xmlns:w16se="http://schemas.microsoft.com/office/word/2015/wordml/symex" mc:Ignorable="w14 w15 w16se">
+<w:styles xmlns:mc="http://schemas.openxmlformats.org/markup-compatibility/2006" xmlns:r="http://schemas.openxmlformats.org/officeDocument/2006/relationships" xmlns:w="http://schemas.openxmlformats.org/wordprocessingml/2006/main" xmlns:w14="http://schemas.microsoft.com/office/word/2010/wordml" xmlns:w15="http://schemas.microsoft.com/office/word/2012/wordml" xmlns:w16cex="http://schemas.microsoft.com/office/word/2018/wordml/cex" xmlns:w16cid="http://schemas.microsoft.com/office/word/2016/wordml/cid" xmlns:w16="http://schemas.microsoft.com/office/word/2018/wordml" xmlns:w16du="http://schemas.microsoft.com/office/word/2023/wordml/word16du" xmlns:w16sdtdh="http://schemas.microsoft.com/office/word/2020/wordml/sdtdatahash" xmlns:w16sdtfl="http://schemas.microsoft.com/office/word/2024/wordml/sdtformatlock" xmlns:w16se="http://schemas.microsoft.com/office/word/2015/wordml/symex" mc:Ignorable="w14 w15 w16se w16cid w16 w16cex w16sdtdh w16sdtfl w16du">
   <w:docDefaults>
     <w:rPrDefault>
       <w:rPr>
@@ -6632,7 +6700,7 @@
       </w:pPr>
     </w:pPrDefault>
   </w:docDefaults>
-  <w:latentStyles w:defLockedState="0" w:defUIPriority="99" w:defSemiHidden="0" w:defUnhideWhenUsed="0" w:defQFormat="0" w:count="371">
+  <w:latentStyles w:defLockedState="0" w:defUIPriority="99" w:defSemiHidden="0" w:defUnhideWhenUsed="0" w:defQFormat="0" w:count="376">
     <w:lsdException w:name="Normal" w:uiPriority="0" w:qFormat="1"/>
     <w:lsdException w:name="heading 1" w:uiPriority="9" w:qFormat="1"/>
     <w:lsdException w:name="heading 2" w:semiHidden="1" w:uiPriority="9" w:unhideWhenUsed="1" w:qFormat="1"/>
@@ -7004,16 +7072,21 @@
     <w:lsdException w:name="List Table 5 Dark Accent 6" w:uiPriority="50"/>
     <w:lsdException w:name="List Table 6 Colorful Accent 6" w:uiPriority="51"/>
     <w:lsdException w:name="List Table 7 Colorful Accent 6" w:uiPriority="52"/>
+    <w:lsdException w:name="Mention" w:semiHidden="1" w:unhideWhenUsed="1"/>
+    <w:lsdException w:name="Smart Hyperlink" w:semiHidden="1" w:unhideWhenUsed="1"/>
+    <w:lsdException w:name="Hashtag" w:semiHidden="1" w:unhideWhenUsed="1"/>
+    <w:lsdException w:name="Unresolved Mention" w:semiHidden="1" w:unhideWhenUsed="1"/>
+    <w:lsdException w:name="Smart Link" w:semiHidden="1" w:unhideWhenUsed="1"/>
   </w:latentStyles>
   <w:style w:type="paragraph" w:default="1" w:styleId="Normal">
     <w:name w:val="Normal"/>
     <w:qFormat/>
   </w:style>
-  <w:style w:type="paragraph" w:styleId="Ttulo1">
+  <w:style w:type="paragraph" w:styleId="Heading1">
     <w:name w:val="heading 1"/>
     <w:basedOn w:val="Normal"/>
     <w:next w:val="Normal"/>
-    <w:link w:val="Ttulo1Car"/>
+    <w:link w:val="Heading1Char"/>
     <w:uiPriority w:val="9"/>
     <w:qFormat/>
     <w:rsid w:val="00FE4ABA"/>
@@ -7030,11 +7103,11 @@
       <w:szCs w:val="32"/>
     </w:rPr>
   </w:style>
-  <w:style w:type="paragraph" w:styleId="Ttulo2">
+  <w:style w:type="paragraph" w:styleId="Heading2">
     <w:name w:val="heading 2"/>
     <w:basedOn w:val="Normal"/>
     <w:next w:val="Normal"/>
-    <w:link w:val="Ttulo2Car"/>
+    <w:link w:val="Heading2Char"/>
     <w:uiPriority w:val="9"/>
     <w:unhideWhenUsed/>
     <w:qFormat/>
@@ -7052,11 +7125,11 @@
       <w:szCs w:val="26"/>
     </w:rPr>
   </w:style>
-  <w:style w:type="paragraph" w:styleId="Ttulo3">
+  <w:style w:type="paragraph" w:styleId="Heading3">
     <w:name w:val="heading 3"/>
     <w:basedOn w:val="Normal"/>
     <w:next w:val="Normal"/>
-    <w:link w:val="Ttulo3Car"/>
+    <w:link w:val="Heading3Char"/>
     <w:uiPriority w:val="9"/>
     <w:unhideWhenUsed/>
     <w:qFormat/>
@@ -7074,13 +7147,13 @@
       <w:szCs w:val="24"/>
     </w:rPr>
   </w:style>
-  <w:style w:type="character" w:default="1" w:styleId="Fuentedeprrafopredeter">
+  <w:style w:type="character" w:default="1" w:styleId="DefaultParagraphFont">
     <w:name w:val="Default Paragraph Font"/>
     <w:uiPriority w:val="1"/>
     <w:semiHidden/>
     <w:unhideWhenUsed/>
   </w:style>
-  <w:style w:type="table" w:default="1" w:styleId="Tablanormal">
+  <w:style w:type="table" w:default="1" w:styleId="TableNormal">
     <w:name w:val="Normal Table"/>
     <w:uiPriority w:val="99"/>
     <w:semiHidden/>
@@ -7095,15 +7168,15 @@
       </w:tblCellMar>
     </w:tblPr>
   </w:style>
-  <w:style w:type="numbering" w:default="1" w:styleId="Sinlista">
+  <w:style w:type="numbering" w:default="1" w:styleId="NoList">
     <w:name w:val="No List"/>
     <w:uiPriority w:val="99"/>
     <w:semiHidden/>
     <w:unhideWhenUsed/>
   </w:style>
-  <w:style w:type="paragraph" w:styleId="Sinespaciado">
+  <w:style w:type="paragraph" w:styleId="NoSpacing">
     <w:name w:val="No Spacing"/>
-    <w:link w:val="SinespaciadoCar"/>
+    <w:link w:val="NoSpacingChar"/>
     <w:uiPriority w:val="1"/>
     <w:qFormat/>
     <w:rsid w:val="00E73CFF"/>
@@ -7115,10 +7188,10 @@
       <w:lang w:eastAsia="es-CL"/>
     </w:rPr>
   </w:style>
-  <w:style w:type="character" w:customStyle="1" w:styleId="SinespaciadoCar">
-    <w:name w:val="Sin espaciado Car"/>
-    <w:basedOn w:val="Fuentedeprrafopredeter"/>
-    <w:link w:val="Sinespaciado"/>
+  <w:style w:type="character" w:customStyle="1" w:styleId="NoSpacingChar">
+    <w:name w:val="No Spacing Char"/>
+    <w:basedOn w:val="DefaultParagraphFont"/>
+    <w:link w:val="NoSpacing"/>
     <w:uiPriority w:val="1"/>
     <w:rsid w:val="00E73CFF"/>
     <w:rPr>
@@ -7126,11 +7199,11 @@
       <w:lang w:eastAsia="es-CL"/>
     </w:rPr>
   </w:style>
-  <w:style w:type="paragraph" w:styleId="Ttulo">
+  <w:style w:type="paragraph" w:styleId="Title">
     <w:name w:val="Title"/>
     <w:basedOn w:val="Normal"/>
     <w:next w:val="Normal"/>
-    <w:link w:val="TtuloCar"/>
+    <w:link w:val="TitleChar"/>
     <w:uiPriority w:val="10"/>
     <w:qFormat/>
     <w:rsid w:val="00E73CFF"/>
@@ -7146,10 +7219,10 @@
       <w:szCs w:val="56"/>
     </w:rPr>
   </w:style>
-  <w:style w:type="character" w:customStyle="1" w:styleId="TtuloCar">
-    <w:name w:val="Título Car"/>
-    <w:basedOn w:val="Fuentedeprrafopredeter"/>
-    <w:link w:val="Ttulo"/>
+  <w:style w:type="character" w:customStyle="1" w:styleId="TitleChar">
+    <w:name w:val="Title Char"/>
+    <w:basedOn w:val="DefaultParagraphFont"/>
+    <w:link w:val="Title"/>
     <w:uiPriority w:val="10"/>
     <w:rsid w:val="00E73CFF"/>
     <w:rPr>
@@ -7160,9 +7233,9 @@
       <w:szCs w:val="56"/>
     </w:rPr>
   </w:style>
-  <w:style w:type="table" w:styleId="Tablaconcuadrcula">
+  <w:style w:type="table" w:styleId="TableGrid">
     <w:name w:val="Table Grid"/>
-    <w:basedOn w:val="Tablanormal"/>
+    <w:basedOn w:val="TableNormal"/>
     <w:uiPriority w:val="39"/>
     <w:rsid w:val="00E73CFF"/>
     <w:pPr>
@@ -7179,10 +7252,10 @@
       </w:tblBorders>
     </w:tblPr>
   </w:style>
-  <w:style w:type="paragraph" w:styleId="Encabezado">
+  <w:style w:type="paragraph" w:styleId="Header">
     <w:name w:val="header"/>
     <w:basedOn w:val="Normal"/>
-    <w:link w:val="EncabezadoCar"/>
+    <w:link w:val="HeaderChar"/>
     <w:unhideWhenUsed/>
     <w:rsid w:val="00DF38AE"/>
     <w:pPr>
@@ -7193,16 +7266,16 @@
       <w:spacing w:after="0" w:line="240" w:lineRule="auto"/>
     </w:pPr>
   </w:style>
-  <w:style w:type="character" w:customStyle="1" w:styleId="EncabezadoCar">
-    <w:name w:val="Encabezado Car"/>
-    <w:basedOn w:val="Fuentedeprrafopredeter"/>
-    <w:link w:val="Encabezado"/>
+  <w:style w:type="character" w:customStyle="1" w:styleId="HeaderChar">
+    <w:name w:val="Header Char"/>
+    <w:basedOn w:val="DefaultParagraphFont"/>
+    <w:link w:val="Header"/>
     <w:rsid w:val="00DF38AE"/>
   </w:style>
-  <w:style w:type="paragraph" w:styleId="Piedepgina">
+  <w:style w:type="paragraph" w:styleId="Footer">
     <w:name w:val="footer"/>
     <w:basedOn w:val="Normal"/>
-    <w:link w:val="PiedepginaCar"/>
+    <w:link w:val="FooterChar"/>
     <w:uiPriority w:val="99"/>
     <w:unhideWhenUsed/>
     <w:rsid w:val="00DF38AE"/>
@@ -7214,16 +7287,16 @@
       <w:spacing w:after="0" w:line="240" w:lineRule="auto"/>
     </w:pPr>
   </w:style>
-  <w:style w:type="character" w:customStyle="1" w:styleId="PiedepginaCar">
-    <w:name w:val="Pie de página Car"/>
-    <w:basedOn w:val="Fuentedeprrafopredeter"/>
-    <w:link w:val="Piedepgina"/>
+  <w:style w:type="character" w:customStyle="1" w:styleId="FooterChar">
+    <w:name w:val="Footer Char"/>
+    <w:basedOn w:val="DefaultParagraphFont"/>
+    <w:link w:val="Footer"/>
     <w:uiPriority w:val="99"/>
     <w:rsid w:val="00DF38AE"/>
   </w:style>
   <w:style w:type="table" w:customStyle="1" w:styleId="Tablanormal11">
     <w:name w:val="Tabla normal 11"/>
-    <w:basedOn w:val="Tablanormal"/>
+    <w:basedOn w:val="TableNormal"/>
     <w:uiPriority w:val="41"/>
     <w:rsid w:val="00F347FC"/>
     <w:pPr>
@@ -7284,10 +7357,10 @@
       </w:tcPr>
     </w:tblStylePr>
   </w:style>
-  <w:style w:type="paragraph" w:styleId="Prrafodelista">
+  <w:style w:type="paragraph" w:styleId="ListParagraph">
     <w:name w:val="List Paragraph"/>
     <w:basedOn w:val="Normal"/>
-    <w:link w:val="PrrafodelistaCar"/>
+    <w:link w:val="ListParagraphChar"/>
     <w:uiPriority w:val="34"/>
     <w:qFormat/>
     <w:rsid w:val="00A4202C"/>
@@ -7296,10 +7369,10 @@
       <w:contextualSpacing/>
     </w:pPr>
   </w:style>
-  <w:style w:type="paragraph" w:styleId="Textodeglobo">
+  <w:style w:type="paragraph" w:styleId="BalloonText">
     <w:name w:val="Balloon Text"/>
     <w:basedOn w:val="Normal"/>
-    <w:link w:val="TextodegloboCar"/>
+    <w:link w:val="BalloonTextChar"/>
     <w:uiPriority w:val="99"/>
     <w:semiHidden/>
     <w:unhideWhenUsed/>
@@ -7313,10 +7386,10 @@
       <w:szCs w:val="18"/>
     </w:rPr>
   </w:style>
-  <w:style w:type="character" w:customStyle="1" w:styleId="TextodegloboCar">
-    <w:name w:val="Texto de globo Car"/>
-    <w:basedOn w:val="Fuentedeprrafopredeter"/>
-    <w:link w:val="Textodeglobo"/>
+  <w:style w:type="character" w:customStyle="1" w:styleId="BalloonTextChar">
+    <w:name w:val="Balloon Text Char"/>
+    <w:basedOn w:val="DefaultParagraphFont"/>
+    <w:link w:val="BalloonText"/>
     <w:uiPriority w:val="99"/>
     <w:semiHidden/>
     <w:rsid w:val="00EF2286"/>
@@ -7326,10 +7399,10 @@
       <w:szCs w:val="18"/>
     </w:rPr>
   </w:style>
-  <w:style w:type="character" w:customStyle="1" w:styleId="Ttulo1Car">
-    <w:name w:val="Título 1 Car"/>
-    <w:basedOn w:val="Fuentedeprrafopredeter"/>
-    <w:link w:val="Ttulo1"/>
+  <w:style w:type="character" w:customStyle="1" w:styleId="Heading1Char">
+    <w:name w:val="Heading 1 Char"/>
+    <w:basedOn w:val="DefaultParagraphFont"/>
+    <w:link w:val="Heading1"/>
     <w:uiPriority w:val="9"/>
     <w:rsid w:val="00FE4ABA"/>
     <w:rPr>
@@ -7339,10 +7412,10 @@
       <w:szCs w:val="32"/>
     </w:rPr>
   </w:style>
-  <w:style w:type="character" w:customStyle="1" w:styleId="Ttulo2Car">
-    <w:name w:val="Título 2 Car"/>
-    <w:basedOn w:val="Fuentedeprrafopredeter"/>
-    <w:link w:val="Ttulo2"/>
+  <w:style w:type="character" w:customStyle="1" w:styleId="Heading2Char">
+    <w:name w:val="Heading 2 Char"/>
+    <w:basedOn w:val="DefaultParagraphFont"/>
+    <w:link w:val="Heading2"/>
     <w:uiPriority w:val="9"/>
     <w:rsid w:val="00FE4ABA"/>
     <w:rPr>
@@ -7352,10 +7425,10 @@
       <w:szCs w:val="26"/>
     </w:rPr>
   </w:style>
-  <w:style w:type="character" w:customStyle="1" w:styleId="Ttulo3Car">
-    <w:name w:val="Título 3 Car"/>
-    <w:basedOn w:val="Fuentedeprrafopredeter"/>
-    <w:link w:val="Ttulo3"/>
+  <w:style w:type="character" w:customStyle="1" w:styleId="Heading3Char">
+    <w:name w:val="Heading 3 Char"/>
+    <w:basedOn w:val="DefaultParagraphFont"/>
+    <w:link w:val="Heading3"/>
     <w:uiPriority w:val="9"/>
     <w:rsid w:val="00FE4ABA"/>
     <w:rPr>
@@ -7381,9 +7454,9 @@
       <w:lang w:eastAsia="es-CL"/>
     </w:rPr>
   </w:style>
-  <w:style w:type="character" w:styleId="Refdecomentario">
+  <w:style w:type="character" w:styleId="CommentReference">
     <w:name w:val="annotation reference"/>
-    <w:basedOn w:val="Fuentedeprrafopredeter"/>
+    <w:basedOn w:val="DefaultParagraphFont"/>
     <w:uiPriority w:val="99"/>
     <w:semiHidden/>
     <w:unhideWhenUsed/>
@@ -7393,10 +7466,10 @@
       <w:szCs w:val="16"/>
     </w:rPr>
   </w:style>
-  <w:style w:type="paragraph" w:styleId="Textocomentario">
+  <w:style w:type="paragraph" w:styleId="CommentText">
     <w:name w:val="annotation text"/>
     <w:basedOn w:val="Normal"/>
-    <w:link w:val="TextocomentarioCar"/>
+    <w:link w:val="CommentTextChar"/>
     <w:uiPriority w:val="99"/>
     <w:unhideWhenUsed/>
     <w:rsid w:val="00284FFB"/>
@@ -7408,10 +7481,10 @@
       <w:szCs w:val="20"/>
     </w:rPr>
   </w:style>
-  <w:style w:type="character" w:customStyle="1" w:styleId="TextocomentarioCar">
-    <w:name w:val="Texto comentario Car"/>
-    <w:basedOn w:val="Fuentedeprrafopredeter"/>
-    <w:link w:val="Textocomentario"/>
+  <w:style w:type="character" w:customStyle="1" w:styleId="CommentTextChar">
+    <w:name w:val="Comment Text Char"/>
+    <w:basedOn w:val="DefaultParagraphFont"/>
+    <w:link w:val="CommentText"/>
     <w:uiPriority w:val="99"/>
     <w:rsid w:val="00284FFB"/>
     <w:rPr>
@@ -7419,11 +7492,11 @@
       <w:szCs w:val="20"/>
     </w:rPr>
   </w:style>
-  <w:style w:type="paragraph" w:styleId="Asuntodelcomentario">
+  <w:style w:type="paragraph" w:styleId="CommentSubject">
     <w:name w:val="annotation subject"/>
-    <w:basedOn w:val="Textocomentario"/>
-    <w:next w:val="Textocomentario"/>
-    <w:link w:val="AsuntodelcomentarioCar"/>
+    <w:basedOn w:val="CommentText"/>
+    <w:next w:val="CommentText"/>
+    <w:link w:val="CommentSubjectChar"/>
     <w:uiPriority w:val="99"/>
     <w:semiHidden/>
     <w:unhideWhenUsed/>
@@ -7433,10 +7506,10 @@
       <w:bCs/>
     </w:rPr>
   </w:style>
-  <w:style w:type="character" w:customStyle="1" w:styleId="AsuntodelcomentarioCar">
-    <w:name w:val="Asunto del comentario Car"/>
-    <w:basedOn w:val="TextocomentarioCar"/>
-    <w:link w:val="Asuntodelcomentario"/>
+  <w:style w:type="character" w:customStyle="1" w:styleId="CommentSubjectChar">
+    <w:name w:val="Comment Subject Char"/>
+    <w:basedOn w:val="CommentTextChar"/>
+    <w:link w:val="CommentSubject"/>
     <w:uiPriority w:val="99"/>
     <w:semiHidden/>
     <w:rsid w:val="00284FFB"/>
@@ -7449,7 +7522,7 @@
   </w:style>
   <w:style w:type="table" w:customStyle="1" w:styleId="Tablaconcuadrcula1clara-nfasis11">
     <w:name w:val="Tabla con cuadrícula 1 clara - Énfasis 11"/>
-    <w:basedOn w:val="Tablanormal"/>
+    <w:basedOn w:val="TableNormal"/>
     <w:uiPriority w:val="46"/>
     <w:rsid w:val="00D267C8"/>
     <w:pPr>
@@ -7504,9 +7577,9 @@
       </w:rPr>
     </w:tblStylePr>
   </w:style>
-  <w:style w:type="character" w:styleId="Hipervnculo">
+  <w:style w:type="character" w:styleId="Hyperlink">
     <w:name w:val="Hyperlink"/>
-    <w:basedOn w:val="Fuentedeprrafopredeter"/>
+    <w:basedOn w:val="DefaultParagraphFont"/>
     <w:uiPriority w:val="99"/>
     <w:unhideWhenUsed/>
     <w:rsid w:val="004E40C0"/>
@@ -7517,7 +7590,7 @@
   </w:style>
   <w:style w:type="character" w:customStyle="1" w:styleId="Mencinsinresolver1">
     <w:name w:val="Mención sin resolver1"/>
-    <w:basedOn w:val="Fuentedeprrafopredeter"/>
+    <w:basedOn w:val="DefaultParagraphFont"/>
     <w:uiPriority w:val="99"/>
     <w:semiHidden/>
     <w:unhideWhenUsed/>
@@ -7527,11 +7600,11 @@
       <w:shd w:val="clear" w:color="auto" w:fill="E1DFDD"/>
     </w:rPr>
   </w:style>
-  <w:style w:type="paragraph" w:styleId="Subttulo">
+  <w:style w:type="paragraph" w:styleId="Subtitle">
     <w:name w:val="Subtitle"/>
     <w:basedOn w:val="Normal"/>
     <w:next w:val="Normal"/>
-    <w:link w:val="SubttuloCar"/>
+    <w:link w:val="SubtitleChar"/>
     <w:uiPriority w:val="19"/>
     <w:unhideWhenUsed/>
     <w:qFormat/>
@@ -7553,10 +7626,10 @@
       <w:lang w:val="en-US" w:eastAsia="ja-JP"/>
     </w:rPr>
   </w:style>
-  <w:style w:type="character" w:customStyle="1" w:styleId="SubttuloCar">
-    <w:name w:val="Subtítulo Car"/>
-    <w:basedOn w:val="Fuentedeprrafopredeter"/>
-    <w:link w:val="Subttulo"/>
+  <w:style w:type="character" w:customStyle="1" w:styleId="SubtitleChar">
+    <w:name w:val="Subtitle Char"/>
+    <w:basedOn w:val="DefaultParagraphFont"/>
+    <w:link w:val="Subtitle"/>
     <w:uiPriority w:val="19"/>
     <w:rsid w:val="00446FDE"/>
     <w:rPr>
@@ -7571,7 +7644,7 @@
   </w:style>
   <w:style w:type="table" w:customStyle="1" w:styleId="Tablafinanciera">
     <w:name w:val="Tabla financiera"/>
-    <w:basedOn w:val="Tablanormal"/>
+    <w:basedOn w:val="TableNormal"/>
     <w:uiPriority w:val="99"/>
     <w:rsid w:val="008C1EBE"/>
     <w:pPr>
@@ -7625,9 +7698,9 @@
       </w:rPr>
     </w:tblStylePr>
   </w:style>
-  <w:style w:type="table" w:styleId="Tablanormal5">
+  <w:style w:type="table" w:styleId="PlainTable5">
     <w:name w:val="Plain Table 5"/>
-    <w:basedOn w:val="Tablanormal"/>
+    <w:basedOn w:val="TableNormal"/>
     <w:uiPriority w:val="45"/>
     <w:rsid w:val="00231F2A"/>
     <w:pPr>
@@ -7745,9 +7818,9 @@
       </w:tcPr>
     </w:tblStylePr>
   </w:style>
-  <w:style w:type="table" w:styleId="Tabladelista2-nfasis5">
+  <w:style w:type="table" w:styleId="ListTable2-Accent5">
     <w:name w:val="List Table 2 Accent 5"/>
-    <w:basedOn w:val="Tablanormal"/>
+    <w:basedOn w:val="TableNormal"/>
     <w:uiPriority w:val="47"/>
     <w:rsid w:val="00231F2A"/>
     <w:pPr>
@@ -7810,9 +7883,9 @@
       <w:lang w:eastAsia="es-CL"/>
     </w:rPr>
   </w:style>
-  <w:style w:type="paragraph" w:styleId="TtuloTDC">
+  <w:style w:type="paragraph" w:styleId="TOCHeading">
     <w:name w:val="TOC Heading"/>
-    <w:basedOn w:val="Ttulo1"/>
+    <w:basedOn w:val="Heading1"/>
     <w:next w:val="Normal"/>
     <w:uiPriority w:val="39"/>
     <w:unhideWhenUsed/>
@@ -7825,13 +7898,13 @@
       <w:lang w:eastAsia="es-CL"/>
     </w:rPr>
   </w:style>
-  <w:style w:type="character" w:customStyle="1" w:styleId="PrrafodelistaCar">
-    <w:name w:val="Párrafo de lista Car"/>
-    <w:link w:val="Prrafodelista"/>
+  <w:style w:type="character" w:customStyle="1" w:styleId="ListParagraphChar">
+    <w:name w:val="List Paragraph Char"/>
+    <w:link w:val="ListParagraph"/>
     <w:uiPriority w:val="34"/>
     <w:rsid w:val="00A46B8F"/>
   </w:style>
-  <w:style w:type="paragraph" w:styleId="TDC1">
+  <w:style w:type="paragraph" w:styleId="TOC1">
     <w:name w:val="toc 1"/>
     <w:basedOn w:val="Normal"/>
     <w:next w:val="Normal"/>
@@ -7843,7 +7916,7 @@
       <w:spacing w:after="100"/>
     </w:pPr>
   </w:style>
-  <w:style w:type="paragraph" w:styleId="TDC2">
+  <w:style w:type="paragraph" w:styleId="TOC2">
     <w:name w:val="toc 2"/>
     <w:basedOn w:val="Normal"/>
     <w:next w:val="Normal"/>
@@ -7856,7 +7929,7 @@
       <w:ind w:left="220"/>
     </w:pPr>
   </w:style>
-  <w:style w:type="paragraph" w:styleId="TDC3">
+  <w:style w:type="paragraph" w:styleId="TOC3">
     <w:name w:val="toc 3"/>
     <w:basedOn w:val="Normal"/>
     <w:next w:val="Normal"/>
@@ -7869,11 +7942,11 @@
       <w:ind w:left="440"/>
     </w:pPr>
   </w:style>
-  <w:style w:type="paragraph" w:styleId="Citadestacada">
+  <w:style w:type="paragraph" w:styleId="IntenseQuote">
     <w:name w:val="Intense Quote"/>
     <w:basedOn w:val="Normal"/>
     <w:next w:val="Normal"/>
-    <w:link w:val="CitadestacadaCar"/>
+    <w:link w:val="IntenseQuoteChar"/>
     <w:uiPriority w:val="30"/>
     <w:qFormat/>
     <w:rsid w:val="00C04221"/>
@@ -7892,10 +7965,10 @@
       <w:color w:val="5B9BD5" w:themeColor="accent1"/>
     </w:rPr>
   </w:style>
-  <w:style w:type="character" w:customStyle="1" w:styleId="CitadestacadaCar">
-    <w:name w:val="Cita destacada Car"/>
-    <w:basedOn w:val="Fuentedeprrafopredeter"/>
-    <w:link w:val="Citadestacada"/>
+  <w:style w:type="character" w:customStyle="1" w:styleId="IntenseQuoteChar">
+    <w:name w:val="Intense Quote Char"/>
+    <w:basedOn w:val="DefaultParagraphFont"/>
+    <w:link w:val="IntenseQuote"/>
     <w:uiPriority w:val="30"/>
     <w:rsid w:val="00C04221"/>
     <w:rPr>
@@ -7906,7 +7979,7 @@
       <w:color w:val="5B9BD5" w:themeColor="accent1"/>
     </w:rPr>
   </w:style>
-  <w:style w:type="paragraph" w:styleId="Descripcin">
+  <w:style w:type="paragraph" w:styleId="Caption">
     <w:name w:val="caption"/>
     <w:basedOn w:val="Normal"/>
     <w:next w:val="Normal"/>
@@ -7927,10 +8000,10 @@
       <w:lang w:val="en-US" w:eastAsia="ja-JP"/>
     </w:rPr>
   </w:style>
-  <w:style w:type="paragraph" w:styleId="Textonotapie">
+  <w:style w:type="paragraph" w:styleId="FootnoteText">
     <w:name w:val="footnote text"/>
     <w:basedOn w:val="Normal"/>
-    <w:link w:val="TextonotapieCar"/>
+    <w:link w:val="FootnoteTextChar"/>
     <w:uiPriority w:val="99"/>
     <w:semiHidden/>
     <w:unhideWhenUsed/>
@@ -7944,10 +8017,10 @@
       <w:lang w:val="es-ES"/>
     </w:rPr>
   </w:style>
-  <w:style w:type="character" w:customStyle="1" w:styleId="TextonotapieCar">
-    <w:name w:val="Texto nota pie Car"/>
-    <w:basedOn w:val="Fuentedeprrafopredeter"/>
-    <w:link w:val="Textonotapie"/>
+  <w:style w:type="character" w:customStyle="1" w:styleId="FootnoteTextChar">
+    <w:name w:val="Footnote Text Char"/>
+    <w:basedOn w:val="DefaultParagraphFont"/>
+    <w:link w:val="FootnoteText"/>
     <w:uiPriority w:val="99"/>
     <w:semiHidden/>
     <w:rsid w:val="005D5259"/>
@@ -7957,9 +8030,9 @@
       <w:lang w:val="es-ES"/>
     </w:rPr>
   </w:style>
-  <w:style w:type="character" w:styleId="Refdenotaalpie">
+  <w:style w:type="character" w:styleId="FootnoteReference">
     <w:name w:val="footnote reference"/>
-    <w:basedOn w:val="Fuentedeprrafopredeter"/>
+    <w:basedOn w:val="DefaultParagraphFont"/>
     <w:unhideWhenUsed/>
     <w:rsid w:val="005D5259"/>
     <w:rPr>
@@ -7968,7 +8041,7 @@
   </w:style>
   <w:style w:type="character" w:customStyle="1" w:styleId="normaltextrun">
     <w:name w:val="normaltextrun"/>
-    <w:basedOn w:val="Fuentedeprrafopredeter"/>
+    <w:basedOn w:val="DefaultParagraphFont"/>
     <w:rsid w:val="0024234D"/>
   </w:style>
   <w:style w:type="paragraph" w:customStyle="1" w:styleId="Default">
@@ -7987,9 +8060,9 @@
       <w:szCs w:val="24"/>
     </w:rPr>
   </w:style>
-  <w:style w:type="table" w:styleId="Cuadrculadetablaclara">
+  <w:style w:type="table" w:styleId="TableGridLight">
     <w:name w:val="Grid Table Light"/>
-    <w:basedOn w:val="Tablanormal"/>
+    <w:basedOn w:val="TableNormal"/>
     <w:uiPriority w:val="40"/>
     <w:rsid w:val="005C4A58"/>
     <w:pPr>
@@ -8008,8 +8081,8 @@
   </w:style>
   <w:style w:type="table" w:customStyle="1" w:styleId="Cuadrculadetablaclara1">
     <w:name w:val="Cuadrícula de tabla clara1"/>
-    <w:basedOn w:val="Tablanormal"/>
-    <w:next w:val="Cuadrculadetablaclara"/>
+    <w:basedOn w:val="TableNormal"/>
+    <w:next w:val="TableGridLight"/>
     <w:uiPriority w:val="40"/>
     <w:rsid w:val="00943DF1"/>
     <w:pPr>
@@ -8040,7 +8113,7 @@
       <w:lang w:eastAsia="es-CL"/>
     </w:rPr>
   </w:style>
-  <w:style w:type="paragraph" w:styleId="Revisin">
+  <w:style w:type="paragraph" w:styleId="Revision">
     <w:name w:val="Revision"/>
     <w:hidden/>
     <w:uiPriority w:val="99"/>
@@ -8050,9 +8123,9 @@
       <w:spacing w:after="0" w:line="240" w:lineRule="auto"/>
     </w:pPr>
   </w:style>
-  <w:style w:type="character" w:styleId="Textoennegrita">
+  <w:style w:type="character" w:styleId="Strong">
     <w:name w:val="Strong"/>
-    <w:basedOn w:val="Fuentedeprrafopredeter"/>
+    <w:basedOn w:val="DefaultParagraphFont"/>
     <w:uiPriority w:val="22"/>
     <w:qFormat/>
     <w:rsid w:val="002C4FB7"/>
@@ -8062,532 +8135,6 @@
     </w:rPr>
   </w:style>
 </w:styles>
-</file>
-
-<file path=word/glossary/document.xml><?xml version="1.0" encoding="utf-8"?>
-<w:glossaryDocument xmlns:wpc="http://schemas.microsoft.com/office/word/2010/wordprocessingCanvas" xmlns:cx="http://schemas.microsoft.com/office/drawing/2014/chartex" xmlns:mc="http://schemas.openxmlformats.org/markup-compatibility/2006" xmlns:o="urn:schemas-microsoft-com:office:office" xmlns:r="http://schemas.openxmlformats.org/officeDocument/2006/relationships" xmlns:m="http://schemas.openxmlformats.org/officeDocument/2006/math" xmlns:v="urn:schemas-microsoft-com:vml" xmlns:wp14="http://schemas.microsoft.com/office/word/2010/wordprocessingDrawing" xmlns:wp="http://schemas.openxmlformats.org/drawingml/2006/wordprocessingDrawing" xmlns:w10="urn:schemas-microsoft-com:office:word" xmlns:w="http://schemas.openxmlformats.org/wordprocessingml/2006/main" xmlns:w14="http://schemas.microsoft.com/office/word/2010/wordml" xmlns:w15="http://schemas.microsoft.com/office/word/2012/wordml" xmlns:w16se="http://schemas.microsoft.com/office/word/2015/wordml/symex" xmlns:wpg="http://schemas.microsoft.com/office/word/2010/wordprocessingGroup" xmlns:wpi="http://schemas.microsoft.com/office/word/2010/wordprocessingInk" xmlns:wne="http://schemas.microsoft.com/office/word/2006/wordml" xmlns:wps="http://schemas.microsoft.com/office/word/2010/wordprocessingShape" mc:Ignorable="w14 w15 w16se wp14"/>
-</file>
-
-<file path=word/glossary/fontTable.xml><?xml version="1.0" encoding="utf-8"?>
-<w:fonts xmlns:mc="http://schemas.openxmlformats.org/markup-compatibility/2006" xmlns:r="http://schemas.openxmlformats.org/officeDocument/2006/relationships" xmlns:w="http://schemas.openxmlformats.org/wordprocessingml/2006/main" xmlns:w14="http://schemas.microsoft.com/office/word/2010/wordml" xmlns:w15="http://schemas.microsoft.com/office/word/2012/wordml" xmlns:w16se="http://schemas.microsoft.com/office/word/2015/wordml/symex" mc:Ignorable="w14 w15 w16se">
-  <w:font w:name="Calibri">
-    <w:panose1 w:val="020F0502020204030204"/>
-    <w:charset w:val="00"/>
-    <w:family w:val="swiss"/>
-    <w:pitch w:val="variable"/>
-    <w:sig w:usb0="E4002EFF" w:usb1="C000247B" w:usb2="00000009" w:usb3="00000000" w:csb0="000001FF" w:csb1="00000000"/>
-  </w:font>
-  <w:font w:name="Times New Roman">
-    <w:panose1 w:val="02020603050405020304"/>
-    <w:charset w:val="00"/>
-    <w:family w:val="roman"/>
-    <w:pitch w:val="variable"/>
-    <w:sig w:usb0="E0002EFF" w:usb1="C000785B" w:usb2="00000009" w:usb3="00000000" w:csb0="000001FF" w:csb1="00000000"/>
-  </w:font>
-  <w:font w:name="Courier New">
-    <w:panose1 w:val="02070309020205020404"/>
-    <w:charset w:val="00"/>
-    <w:family w:val="modern"/>
-    <w:pitch w:val="fixed"/>
-    <w:sig w:usb0="E0002EFF" w:usb1="C0007843" w:usb2="00000009" w:usb3="00000000" w:csb0="000001FF" w:csb1="00000000"/>
-  </w:font>
-  <w:font w:name="Wingdings">
-    <w:panose1 w:val="05000000000000000000"/>
-    <w:charset w:val="02"/>
-    <w:family w:val="auto"/>
-    <w:pitch w:val="variable"/>
-    <w:sig w:usb0="00000000" w:usb1="10000000" w:usb2="00000000" w:usb3="00000000" w:csb0="80000000" w:csb1="00000000"/>
-  </w:font>
-  <w:font w:name="Symbol">
-    <w:panose1 w:val="05050102010706020507"/>
-    <w:charset w:val="02"/>
-    <w:family w:val="roman"/>
-    <w:pitch w:val="variable"/>
-    <w:sig w:usb0="00000000" w:usb1="10000000" w:usb2="00000000" w:usb3="00000000" w:csb0="80000000" w:csb1="00000000"/>
-  </w:font>
-  <w:font w:name="Calibri Light">
-    <w:panose1 w:val="020F0302020204030204"/>
-    <w:charset w:val="00"/>
-    <w:family w:val="swiss"/>
-    <w:pitch w:val="variable"/>
-    <w:sig w:usb0="E4002EFF" w:usb1="C000247B" w:usb2="00000009" w:usb3="00000000" w:csb0="000001FF" w:csb1="00000000"/>
-  </w:font>
-  <w:font w:name="Segoe UI">
-    <w:panose1 w:val="020B0502040204020203"/>
-    <w:charset w:val="00"/>
-    <w:family w:val="swiss"/>
-    <w:pitch w:val="variable"/>
-    <w:sig w:usb0="E4002EFF" w:usb1="C000E47F" w:usb2="00000009" w:usb3="00000000" w:csb0="000001FF" w:csb1="00000000"/>
-  </w:font>
-  <w:font w:name="Century Gothic">
-    <w:panose1 w:val="020B0502020202020204"/>
-    <w:charset w:val="00"/>
-    <w:family w:val="swiss"/>
-    <w:pitch w:val="variable"/>
-    <w:sig w:usb0="00000287" w:usb1="00000000" w:usb2="00000000" w:usb3="00000000" w:csb0="0000009F" w:csb1="00000000"/>
-  </w:font>
-</w:fonts>
-</file>
-
-<file path=word/glossary/settings.xml><?xml version="1.0" encoding="utf-8"?>
-<w:settings xmlns:mc="http://schemas.openxmlformats.org/markup-compatibility/2006" xmlns:o="urn:schemas-microsoft-com:office:office" xmlns:r="http://schemas.openxmlformats.org/officeDocument/2006/relationships" xmlns:m="http://schemas.openxmlformats.org/officeDocument/2006/math" xmlns:v="urn:schemas-microsoft-com:vml" xmlns:w10="urn:schemas-microsoft-com:office:word" xmlns:w="http://schemas.openxmlformats.org/wordprocessingml/2006/main" xmlns:w14="http://schemas.microsoft.com/office/word/2010/wordml" xmlns:w15="http://schemas.microsoft.com/office/word/2012/wordml" xmlns:w16se="http://schemas.microsoft.com/office/word/2015/wordml/symex" xmlns:sl="http://schemas.openxmlformats.org/schemaLibrary/2006/main" mc:Ignorable="w14 w15 w16se">
-  <w:defaultTabStop w:val="708"/>
-  <w:hyphenationZone w:val="425"/>
-  <w:characterSpacingControl w:val="doNotCompress"/>
-  <w:compat>
-    <w:useFELayout/>
-    <w:compatSetting w:name="compatibilityMode" w:uri="http://schemas.microsoft.com/office/word" w:val="12"/>
-  </w:compat>
-  <w:rsids>
-    <w:rsidRoot w:val="009A1234"/>
-    <w:rsid w:val="009A1234"/>
-  </w:rsids>
-  <m:mathPr>
-    <m:mathFont m:val="Cambria Math"/>
-    <m:brkBin m:val="before"/>
-    <m:brkBinSub m:val="--"/>
-    <m:smallFrac m:val="0"/>
-    <m:dispDef/>
-    <m:lMargin m:val="0"/>
-    <m:rMargin m:val="0"/>
-    <m:defJc m:val="centerGroup"/>
-    <m:wrapIndent m:val="1440"/>
-    <m:intLim m:val="subSup"/>
-    <m:naryLim m:val="undOvr"/>
-  </m:mathPr>
-  <w:themeFontLang w:val="es-CL"/>
-  <w:clrSchemeMapping w:bg1="light1" w:t1="dark1" w:bg2="light2" w:t2="dark2" w:accent1="accent1" w:accent2="accent2" w:accent3="accent3" w:accent4="accent4" w:accent5="accent5" w:accent6="accent6" w:hyperlink="hyperlink" w:followedHyperlink="followedHyperlink"/>
-  <w:decimalSymbol w:val=","/>
-  <w:listSeparator w:val=";"/>
-</w:settings>
-</file>
-
-<file path=word/glossary/styles.xml><?xml version="1.0" encoding="utf-8"?>
-<w:styles xmlns:mc="http://schemas.openxmlformats.org/markup-compatibility/2006" xmlns:r="http://schemas.openxmlformats.org/officeDocument/2006/relationships" xmlns:w="http://schemas.openxmlformats.org/wordprocessingml/2006/main" xmlns:w14="http://schemas.microsoft.com/office/word/2010/wordml" xmlns:w15="http://schemas.microsoft.com/office/word/2012/wordml" xmlns:w16se="http://schemas.microsoft.com/office/word/2015/wordml/symex" mc:Ignorable="w14 w15 w16se">
-  <w:docDefaults>
-    <w:rPrDefault>
-      <w:rPr>
-        <w:rFonts w:asciiTheme="minorHAnsi" w:eastAsiaTheme="minorEastAsia" w:hAnsiTheme="minorHAnsi" w:cstheme="minorBidi"/>
-        <w:sz w:val="22"/>
-        <w:szCs w:val="22"/>
-        <w:lang w:val="es-CL" w:eastAsia="es-CL" w:bidi="ar-SA"/>
-      </w:rPr>
-    </w:rPrDefault>
-    <w:pPrDefault>
-      <w:pPr>
-        <w:spacing w:after="160" w:line="259" w:lineRule="auto"/>
-      </w:pPr>
-    </w:pPrDefault>
-  </w:docDefaults>
-  <w:latentStyles w:defLockedState="0" w:defUIPriority="99" w:defSemiHidden="0" w:defUnhideWhenUsed="0" w:defQFormat="0" w:count="371">
-    <w:lsdException w:name="Normal" w:uiPriority="0" w:qFormat="1"/>
-    <w:lsdException w:name="heading 1" w:uiPriority="9" w:qFormat="1"/>
-    <w:lsdException w:name="heading 2" w:semiHidden="1" w:uiPriority="9" w:unhideWhenUsed="1" w:qFormat="1"/>
-    <w:lsdException w:name="heading 3" w:semiHidden="1" w:uiPriority="9" w:unhideWhenUsed="1" w:qFormat="1"/>
-    <w:lsdException w:name="heading 4" w:semiHidden="1" w:uiPriority="9" w:unhideWhenUsed="1" w:qFormat="1"/>
-    <w:lsdException w:name="heading 5" w:semiHidden="1" w:uiPriority="9" w:unhideWhenUsed="1" w:qFormat="1"/>
-    <w:lsdException w:name="heading 6" w:semiHidden="1" w:uiPriority="9" w:unhideWhenUsed="1" w:qFormat="1"/>
-    <w:lsdException w:name="heading 7" w:semiHidden="1" w:uiPriority="9" w:unhideWhenUsed="1" w:qFormat="1"/>
-    <w:lsdException w:name="heading 8" w:semiHidden="1" w:uiPriority="9" w:unhideWhenUsed="1" w:qFormat="1"/>
-    <w:lsdException w:name="heading 9" w:semiHidden="1" w:uiPriority="9" w:unhideWhenUsed="1" w:qFormat="1"/>
-    <w:lsdException w:name="index 1" w:semiHidden="1" w:unhideWhenUsed="1"/>
-    <w:lsdException w:name="index 2" w:semiHidden="1" w:unhideWhenUsed="1"/>
-    <w:lsdException w:name="index 3" w:semiHidden="1" w:unhideWhenUsed="1"/>
-    <w:lsdException w:name="index 4" w:semiHidden="1" w:unhideWhenUsed="1"/>
-    <w:lsdException w:name="index 5" w:semiHidden="1" w:unhideWhenUsed="1"/>
-    <w:lsdException w:name="index 6" w:semiHidden="1" w:unhideWhenUsed="1"/>
-    <w:lsdException w:name="index 7" w:semiHidden="1" w:unhideWhenUsed="1"/>
-    <w:lsdException w:name="index 8" w:semiHidden="1" w:unhideWhenUsed="1"/>
-    <w:lsdException w:name="index 9" w:semiHidden="1" w:unhideWhenUsed="1"/>
-    <w:lsdException w:name="toc 1" w:semiHidden="1" w:uiPriority="39" w:unhideWhenUsed="1"/>
-    <w:lsdException w:name="toc 2" w:semiHidden="1" w:uiPriority="39" w:unhideWhenUsed="1"/>
-    <w:lsdException w:name="toc 3" w:semiHidden="1" w:uiPriority="39" w:unhideWhenUsed="1"/>
-    <w:lsdException w:name="toc 4" w:semiHidden="1" w:uiPriority="39" w:unhideWhenUsed="1"/>
-    <w:lsdException w:name="toc 5" w:semiHidden="1" w:uiPriority="39" w:unhideWhenUsed="1"/>
-    <w:lsdException w:name="toc 6" w:semiHidden="1" w:uiPriority="39" w:unhideWhenUsed="1"/>
-    <w:lsdException w:name="toc 7" w:semiHidden="1" w:uiPriority="39" w:unhideWhenUsed="1"/>
-    <w:lsdException w:name="toc 8" w:semiHidden="1" w:uiPriority="39" w:unhideWhenUsed="1"/>
-    <w:lsdException w:name="toc 9" w:semiHidden="1" w:uiPriority="39" w:unhideWhenUsed="1"/>
-    <w:lsdException w:name="Normal Indent" w:semiHidden="1" w:unhideWhenUsed="1"/>
-    <w:lsdException w:name="footnote text" w:semiHidden="1" w:unhideWhenUsed="1"/>
-    <w:lsdException w:name="annotation text" w:semiHidden="1" w:unhideWhenUsed="1"/>
-    <w:lsdException w:name="header" w:semiHidden="1" w:unhideWhenUsed="1"/>
-    <w:lsdException w:name="footer" w:semiHidden="1" w:unhideWhenUsed="1"/>
-    <w:lsdException w:name="index heading" w:semiHidden="1" w:unhideWhenUsed="1"/>
-    <w:lsdException w:name="caption" w:semiHidden="1" w:uiPriority="35" w:unhideWhenUsed="1" w:qFormat="1"/>
-    <w:lsdException w:name="table of figures" w:semiHidden="1" w:unhideWhenUsed="1"/>
-    <w:lsdException w:name="envelope address" w:semiHidden="1" w:unhideWhenUsed="1"/>
-    <w:lsdException w:name="envelope return" w:semiHidden="1" w:unhideWhenUsed="1"/>
-    <w:lsdException w:name="footnote reference" w:semiHidden="1" w:unhideWhenUsed="1"/>
-    <w:lsdException w:name="annotation reference" w:semiHidden="1" w:unhideWhenUsed="1"/>
-    <w:lsdException w:name="line number" w:semiHidden="1" w:unhideWhenUsed="1"/>
-    <w:lsdException w:name="page number" w:semiHidden="1" w:unhideWhenUsed="1"/>
-    <w:lsdException w:name="endnote reference" w:semiHidden="1" w:unhideWhenUsed="1"/>
-    <w:lsdException w:name="endnote text" w:semiHidden="1" w:unhideWhenUsed="1"/>
-    <w:lsdException w:name="table of authorities" w:semiHidden="1" w:unhideWhenUsed="1"/>
-    <w:lsdException w:name="macro" w:semiHidden="1" w:unhideWhenUsed="1"/>
-    <w:lsdException w:name="toa heading" w:semiHidden="1" w:unhideWhenUsed="1"/>
-    <w:lsdException w:name="List" w:semiHidden="1" w:unhideWhenUsed="1"/>
-    <w:lsdException w:name="List Bullet" w:semiHidden="1" w:unhideWhenUsed="1"/>
-    <w:lsdException w:name="List Number" w:semiHidden="1" w:unhideWhenUsed="1"/>
-    <w:lsdException w:name="List 2" w:semiHidden="1" w:unhideWhenUsed="1"/>
-    <w:lsdException w:name="List 3" w:semiHidden="1" w:unhideWhenUsed="1"/>
-    <w:lsdException w:name="List 4" w:semiHidden="1" w:unhideWhenUsed="1"/>
-    <w:lsdException w:name="List 5" w:semiHidden="1" w:unhideWhenUsed="1"/>
-    <w:lsdException w:name="List Bullet 2" w:semiHidden="1" w:unhideWhenUsed="1"/>
-    <w:lsdException w:name="List Bullet 3" w:semiHidden="1" w:unhideWhenUsed="1"/>
-    <w:lsdException w:name="List Bullet 4" w:semiHidden="1" w:unhideWhenUsed="1"/>
-    <w:lsdException w:name="List Bullet 5" w:semiHidden="1" w:unhideWhenUsed="1"/>
-    <w:lsdException w:name="List Number 2" w:semiHidden="1" w:unhideWhenUsed="1"/>
-    <w:lsdException w:name="List Number 3" w:semiHidden="1" w:unhideWhenUsed="1"/>
-    <w:lsdException w:name="List Number 4" w:semiHidden="1" w:unhideWhenUsed="1"/>
-    <w:lsdException w:name="List Number 5" w:semiHidden="1" w:unhideWhenUsed="1"/>
-    <w:lsdException w:name="Title" w:uiPriority="10" w:qFormat="1"/>
-    <w:lsdException w:name="Closing" w:semiHidden="1" w:unhideWhenUsed="1"/>
-    <w:lsdException w:name="Signature" w:semiHidden="1" w:unhideWhenUsed="1"/>
-    <w:lsdException w:name="Default Paragraph Font" w:semiHidden="1" w:uiPriority="1" w:unhideWhenUsed="1"/>
-    <w:lsdException w:name="Body Text" w:semiHidden="1" w:unhideWhenUsed="1"/>
-    <w:lsdException w:name="Body Text Indent" w:semiHidden="1" w:unhideWhenUsed="1"/>
-    <w:lsdException w:name="List Continue" w:semiHidden="1" w:unhideWhenUsed="1"/>
-    <w:lsdException w:name="List Continue 2" w:semiHidden="1" w:unhideWhenUsed="1"/>
-    <w:lsdException w:name="List Continue 3" w:semiHidden="1" w:unhideWhenUsed="1"/>
-    <w:lsdException w:name="List Continue 4" w:semiHidden="1" w:unhideWhenUsed="1"/>
-    <w:lsdException w:name="List Continue 5" w:semiHidden="1" w:unhideWhenUsed="1"/>
-    <w:lsdException w:name="Message Header" w:semiHidden="1" w:unhideWhenUsed="1"/>
-    <w:lsdException w:name="Subtitle" w:uiPriority="11" w:qFormat="1"/>
-    <w:lsdException w:name="Salutation" w:semiHidden="1" w:unhideWhenUsed="1"/>
-    <w:lsdException w:name="Date" w:semiHidden="1" w:unhideWhenUsed="1"/>
-    <w:lsdException w:name="Body Text First Indent" w:semiHidden="1" w:unhideWhenUsed="1"/>
-    <w:lsdException w:name="Body Text First Indent 2" w:semiHidden="1" w:unhideWhenUsed="1"/>
-    <w:lsdException w:name="Note Heading" w:semiHidden="1" w:unhideWhenUsed="1"/>
-    <w:lsdException w:name="Body Text 2" w:semiHidden="1" w:unhideWhenUsed="1"/>
-    <w:lsdException w:name="Body Text 3" w:semiHidden="1" w:unhideWhenUsed="1"/>
-    <w:lsdException w:name="Body Text Indent 2" w:semiHidden="1" w:unhideWhenUsed="1"/>
-    <w:lsdException w:name="Body Text Indent 3" w:semiHidden="1" w:unhideWhenUsed="1"/>
-    <w:lsdException w:name="Block Text" w:semiHidden="1" w:unhideWhenUsed="1"/>
-    <w:lsdException w:name="Hyperlink" w:semiHidden="1" w:unhideWhenUsed="1"/>
-    <w:lsdException w:name="FollowedHyperlink" w:semiHidden="1" w:unhideWhenUsed="1"/>
-    <w:lsdException w:name="Strong" w:uiPriority="22" w:qFormat="1"/>
-    <w:lsdException w:name="Emphasis" w:uiPriority="20" w:qFormat="1"/>
-    <w:lsdException w:name="Document Map" w:semiHidden="1" w:unhideWhenUsed="1"/>
-    <w:lsdException w:name="Plain Text" w:semiHidden="1" w:unhideWhenUsed="1"/>
-    <w:lsdException w:name="E-mail Signature" w:semiHidden="1" w:unhideWhenUsed="1"/>
-    <w:lsdException w:name="HTML Top of Form" w:semiHidden="1" w:unhideWhenUsed="1"/>
-    <w:lsdException w:name="HTML Bottom of Form" w:semiHidden="1" w:unhideWhenUsed="1"/>
-    <w:lsdException w:name="Normal (Web)" w:semiHidden="1" w:unhideWhenUsed="1"/>
-    <w:lsdException w:name="HTML Acronym" w:semiHidden="1" w:unhideWhenUsed="1"/>
-    <w:lsdException w:name="HTML Address" w:semiHidden="1" w:unhideWhenUsed="1"/>
-    <w:lsdException w:name="HTML Cite" w:semiHidden="1" w:unhideWhenUsed="1"/>
-    <w:lsdException w:name="HTML Code" w:semiHidden="1" w:unhideWhenUsed="1"/>
-    <w:lsdException w:name="HTML Definition" w:semiHidden="1" w:unhideWhenUsed="1"/>
-    <w:lsdException w:name="HTML Keyboard" w:semiHidden="1" w:unhideWhenUsed="1"/>
-    <w:lsdException w:name="HTML Preformatted" w:semiHidden="1" w:unhideWhenUsed="1"/>
-    <w:lsdException w:name="HTML Sample" w:semiHidden="1" w:unhideWhenUsed="1"/>
-    <w:lsdException w:name="HTML Typewriter" w:semiHidden="1" w:unhideWhenUsed="1"/>
-    <w:lsdException w:name="HTML Variable" w:semiHidden="1" w:unhideWhenUsed="1"/>
-    <w:lsdException w:name="Normal Table" w:semiHidden="1" w:unhideWhenUsed="1"/>
-    <w:lsdException w:name="annotation subject" w:semiHidden="1" w:unhideWhenUsed="1"/>
-    <w:lsdException w:name="No List" w:semiHidden="1" w:unhideWhenUsed="1"/>
-    <w:lsdException w:name="Outline List 1" w:semiHidden="1" w:unhideWhenUsed="1"/>
-    <w:lsdException w:name="Outline List 2" w:semiHidden="1" w:unhideWhenUsed="1"/>
-    <w:lsdException w:name="Outline List 3" w:semiHidden="1" w:unhideWhenUsed="1"/>
-    <w:lsdException w:name="Table Simple 1" w:semiHidden="1" w:unhideWhenUsed="1"/>
-    <w:lsdException w:name="Table Simple 2" w:semiHidden="1" w:unhideWhenUsed="1"/>
-    <w:lsdException w:name="Table Simple 3" w:semiHidden="1" w:unhideWhenUsed="1"/>
-    <w:lsdException w:name="Table Classic 1" w:semiHidden="1" w:unhideWhenUsed="1"/>
-    <w:lsdException w:name="Table Classic 2" w:semiHidden="1" w:unhideWhenUsed="1"/>
-    <w:lsdException w:name="Table Classic 3" w:semiHidden="1" w:unhideWhenUsed="1"/>
-    <w:lsdException w:name="Table Classic 4" w:semiHidden="1" w:unhideWhenUsed="1"/>
-    <w:lsdException w:name="Table Colorful 1" w:semiHidden="1" w:unhideWhenUsed="1"/>
-    <w:lsdException w:name="Table Colorful 2" w:semiHidden="1" w:unhideWhenUsed="1"/>
-    <w:lsdException w:name="Table Colorful 3" w:semiHidden="1" w:unhideWhenUsed="1"/>
-    <w:lsdException w:name="Table Columns 1" w:semiHidden="1" w:unhideWhenUsed="1"/>
-    <w:lsdException w:name="Table Columns 2" w:semiHidden="1" w:unhideWhenUsed="1"/>
-    <w:lsdException w:name="Table Columns 3" w:semiHidden="1" w:unhideWhenUsed="1"/>
-    <w:lsdException w:name="Table Columns 4" w:semiHidden="1" w:unhideWhenUsed="1"/>
-    <w:lsdException w:name="Table Columns 5" w:semiHidden="1" w:unhideWhenUsed="1"/>
-    <w:lsdException w:name="Table Grid 1" w:semiHidden="1" w:unhideWhenUsed="1"/>
-    <w:lsdException w:name="Table Grid 2" w:semiHidden="1" w:unhideWhenUsed="1"/>
-    <w:lsdException w:name="Table Grid 3" w:semiHidden="1" w:unhideWhenUsed="1"/>
-    <w:lsdException w:name="Table Grid 4" w:semiHidden="1" w:unhideWhenUsed="1"/>
-    <w:lsdException w:name="Table Grid 5" w:semiHidden="1" w:unhideWhenUsed="1"/>
-    <w:lsdException w:name="Table Grid 6" w:semiHidden="1" w:unhideWhenUsed="1"/>
-    <w:lsdException w:name="Table Grid 7" w:semiHidden="1" w:unhideWhenUsed="1"/>
-    <w:lsdException w:name="Table Grid 8" w:semiHidden="1" w:unhideWhenUsed="1"/>
-    <w:lsdException w:name="Table List 1" w:semiHidden="1" w:unhideWhenUsed="1"/>
-    <w:lsdException w:name="Table List 2" w:semiHidden="1" w:unhideWhenUsed="1"/>
-    <w:lsdException w:name="Table List 3" w:semiHidden="1" w:unhideWhenUsed="1"/>
-    <w:lsdException w:name="Table List 4" w:semiHidden="1" w:unhideWhenUsed="1"/>
-    <w:lsdException w:name="Table List 5" w:semiHidden="1" w:unhideWhenUsed="1"/>
-    <w:lsdException w:name="Table List 6" w:semiHidden="1" w:unhideWhenUsed="1"/>
-    <w:lsdException w:name="Table List 7" w:semiHidden="1" w:unhideWhenUsed="1"/>
-    <w:lsdException w:name="Table List 8" w:semiHidden="1" w:unhideWhenUsed="1"/>
-    <w:lsdException w:name="Table 3D effects 1" w:semiHidden="1" w:unhideWhenUsed="1"/>
-    <w:lsdException w:name="Table 3D effects 2" w:semiHidden="1" w:unhideWhenUsed="1"/>
-    <w:lsdException w:name="Table 3D effects 3" w:semiHidden="1" w:unhideWhenUsed="1"/>
-    <w:lsdException w:name="Table Contemporary" w:semiHidden="1" w:unhideWhenUsed="1"/>
-    <w:lsdException w:name="Table Elegant" w:semiHidden="1" w:unhideWhenUsed="1"/>
-    <w:lsdException w:name="Table Professional" w:semiHidden="1" w:unhideWhenUsed="1"/>
-    <w:lsdException w:name="Table Subtle 1" w:semiHidden="1" w:unhideWhenUsed="1"/>
-    <w:lsdException w:name="Table Subtle 2" w:semiHidden="1" w:unhideWhenUsed="1"/>
-    <w:lsdException w:name="Table Web 1" w:semiHidden="1" w:unhideWhenUsed="1"/>
-    <w:lsdException w:name="Table Web 2" w:semiHidden="1" w:unhideWhenUsed="1"/>
-    <w:lsdException w:name="Table Web 3" w:semiHidden="1" w:unhideWhenUsed="1"/>
-    <w:lsdException w:name="Balloon Text" w:semiHidden="1" w:unhideWhenUsed="1"/>
-    <w:lsdException w:name="Table Grid" w:uiPriority="39"/>
-    <w:lsdException w:name="Table Theme" w:semiHidden="1" w:unhideWhenUsed="1"/>
-    <w:lsdException w:name="Placeholder Text" w:semiHidden="1"/>
-    <w:lsdException w:name="No Spacing" w:uiPriority="1" w:qFormat="1"/>
-    <w:lsdException w:name="Light Shading" w:uiPriority="60"/>
-    <w:lsdException w:name="Light List" w:uiPriority="61"/>
-    <w:lsdException w:name="Light Grid" w:uiPriority="62"/>
-    <w:lsdException w:name="Medium Shading 1" w:uiPriority="63"/>
-    <w:lsdException w:name="Medium Shading 2" w:uiPriority="64"/>
-    <w:lsdException w:name="Medium List 1" w:uiPriority="65"/>
-    <w:lsdException w:name="Medium List 2" w:uiPriority="66"/>
-    <w:lsdException w:name="Medium Grid 1" w:uiPriority="67"/>
-    <w:lsdException w:name="Medium Grid 2" w:uiPriority="68"/>
-    <w:lsdException w:name="Medium Grid 3" w:uiPriority="69"/>
-    <w:lsdException w:name="Dark List" w:uiPriority="70"/>
-    <w:lsdException w:name="Colorful Shading" w:uiPriority="71"/>
-    <w:lsdException w:name="Colorful List" w:uiPriority="72"/>
-    <w:lsdException w:name="Colorful Grid" w:uiPriority="73"/>
-    <w:lsdException w:name="Light Shading Accent 1" w:uiPriority="60"/>
-    <w:lsdException w:name="Light List Accent 1" w:uiPriority="61"/>
-    <w:lsdException w:name="Light Grid Accent 1" w:uiPriority="62"/>
-    <w:lsdException w:name="Medium Shading 1 Accent 1" w:uiPriority="63"/>
-    <w:lsdException w:name="Medium Shading 2 Accent 1" w:uiPriority="64"/>
-    <w:lsdException w:name="Medium List 1 Accent 1" w:uiPriority="65"/>
-    <w:lsdException w:name="Revision" w:semiHidden="1"/>
-    <w:lsdException w:name="List Paragraph" w:uiPriority="34" w:qFormat="1"/>
-    <w:lsdException w:name="Quote" w:uiPriority="29" w:qFormat="1"/>
-    <w:lsdException w:name="Intense Quote" w:uiPriority="30" w:qFormat="1"/>
-    <w:lsdException w:name="Medium List 2 Accent 1" w:uiPriority="66"/>
-    <w:lsdException w:name="Medium Grid 1 Accent 1" w:uiPriority="67"/>
-    <w:lsdException w:name="Medium Grid 2 Accent 1" w:uiPriority="68"/>
-    <w:lsdException w:name="Medium Grid 3 Accent 1" w:uiPriority="69"/>
-    <w:lsdException w:name="Dark List Accent 1" w:uiPriority="70"/>
-    <w:lsdException w:name="Colorful Shading Accent 1" w:uiPriority="71"/>
-    <w:lsdException w:name="Colorful List Accent 1" w:uiPriority="72"/>
-    <w:lsdException w:name="Colorful Grid Accent 1" w:uiPriority="73"/>
-    <w:lsdException w:name="Light Shading Accent 2" w:uiPriority="60"/>
-    <w:lsdException w:name="Light List Accent 2" w:uiPriority="61"/>
-    <w:lsdException w:name="Light Grid Accent 2" w:uiPriority="62"/>
-    <w:lsdException w:name="Medium Shading 1 Accent 2" w:uiPriority="63"/>
-    <w:lsdException w:name="Medium Shading 2 Accent 2" w:uiPriority="64"/>
-    <w:lsdException w:name="Medium List 1 Accent 2" w:uiPriority="65"/>
-    <w:lsdException w:name="Medium List 2 Accent 2" w:uiPriority="66"/>
-    <w:lsdException w:name="Medium Grid 1 Accent 2" w:uiPriority="67"/>
-    <w:lsdException w:name="Medium Grid 2 Accent 2" w:uiPriority="68"/>
-    <w:lsdException w:name="Medium Grid 3 Accent 2" w:uiPriority="69"/>
-    <w:lsdException w:name="Dark List Accent 2" w:uiPriority="70"/>
-    <w:lsdException w:name="Colorful Shading Accent 2" w:uiPriority="71"/>
-    <w:lsdException w:name="Colorful List Accent 2" w:uiPriority="72"/>
-    <w:lsdException w:name="Colorful Grid Accent 2" w:uiPriority="73"/>
-    <w:lsdException w:name="Light Shading Accent 3" w:uiPriority="60"/>
-    <w:lsdException w:name="Light List Accent 3" w:uiPriority="61"/>
-    <w:lsdException w:name="Light Grid Accent 3" w:uiPriority="62"/>
-    <w:lsdException w:name="Medium Shading 1 Accent 3" w:uiPriority="63"/>
-    <w:lsdException w:name="Medium Shading 2 Accent 3" w:uiPriority="64"/>
-    <w:lsdException w:name="Medium List 1 Accent 3" w:uiPriority="65"/>
-    <w:lsdException w:name="Medium List 2 Accent 3" w:uiPriority="66"/>
-    <w:lsdException w:name="Medium Grid 1 Accent 3" w:uiPriority="67"/>
-    <w:lsdException w:name="Medium Grid 2 Accent 3" w:uiPriority="68"/>
-    <w:lsdException w:name="Medium Grid 3 Accent 3" w:uiPriority="69"/>
-    <w:lsdException w:name="Dark List Accent 3" w:uiPriority="70"/>
-    <w:lsdException w:name="Colorful Shading Accent 3" w:uiPriority="71"/>
-    <w:lsdException w:name="Colorful List Accent 3" w:uiPriority="72"/>
-    <w:lsdException w:name="Colorful Grid Accent 3" w:uiPriority="73"/>
-    <w:lsdException w:name="Light Shading Accent 4" w:uiPriority="60"/>
-    <w:lsdException w:name="Light List Accent 4" w:uiPriority="61"/>
-    <w:lsdException w:name="Light Grid Accent 4" w:uiPriority="62"/>
-    <w:lsdException w:name="Medium Shading 1 Accent 4" w:uiPriority="63"/>
-    <w:lsdException w:name="Medium Shading 2 Accent 4" w:uiPriority="64"/>
-    <w:lsdException w:name="Medium List 1 Accent 4" w:uiPriority="65"/>
-    <w:lsdException w:name="Medium List 2 Accent 4" w:uiPriority="66"/>
-    <w:lsdException w:name="Medium Grid 1 Accent 4" w:uiPriority="67"/>
-    <w:lsdException w:name="Medium Grid 2 Accent 4" w:uiPriority="68"/>
-    <w:lsdException w:name="Medium Grid 3 Accent 4" w:uiPriority="69"/>
-    <w:lsdException w:name="Dark List Accent 4" w:uiPriority="70"/>
-    <w:lsdException w:name="Colorful Shading Accent 4" w:uiPriority="71"/>
-    <w:lsdException w:name="Colorful List Accent 4" w:uiPriority="72"/>
-    <w:lsdException w:name="Colorful Grid Accent 4" w:uiPriority="73"/>
-    <w:lsdException w:name="Light Shading Accent 5" w:uiPriority="60"/>
-    <w:lsdException w:name="Light List Accent 5" w:uiPriority="61"/>
-    <w:lsdException w:name="Light Grid Accent 5" w:uiPriority="62"/>
-    <w:lsdException w:name="Medium Shading 1 Accent 5" w:uiPriority="63"/>
-    <w:lsdException w:name="Medium Shading 2 Accent 5" w:uiPriority="64"/>
-    <w:lsdException w:name="Medium List 1 Accent 5" w:uiPriority="65"/>
-    <w:lsdException w:name="Medium List 2 Accent 5" w:uiPriority="66"/>
-    <w:lsdException w:name="Medium Grid 1 Accent 5" w:uiPriority="67"/>
-    <w:lsdException w:name="Medium Grid 2 Accent 5" w:uiPriority="68"/>
-    <w:lsdException w:name="Medium Grid 3 Accent 5" w:uiPriority="69"/>
-    <w:lsdException w:name="Dark List Accent 5" w:uiPriority="70"/>
-    <w:lsdException w:name="Colorful Shading Accent 5" w:uiPriority="71"/>
-    <w:lsdException w:name="Colorful List Accent 5" w:uiPriority="72"/>
-    <w:lsdException w:name="Colorful Grid Accent 5" w:uiPriority="73"/>
-    <w:lsdException w:name="Light Shading Accent 6" w:uiPriority="60"/>
-    <w:lsdException w:name="Light List Accent 6" w:uiPriority="61"/>
-    <w:lsdException w:name="Light Grid Accent 6" w:uiPriority="62"/>
-    <w:lsdException w:name="Medium Shading 1 Accent 6" w:uiPriority="63"/>
-    <w:lsdException w:name="Medium Shading 2 Accent 6" w:uiPriority="64"/>
-    <w:lsdException w:name="Medium List 1 Accent 6" w:uiPriority="65"/>
-    <w:lsdException w:name="Medium List 2 Accent 6" w:uiPriority="66"/>
-    <w:lsdException w:name="Medium Grid 1 Accent 6" w:uiPriority="67"/>
-    <w:lsdException w:name="Medium Grid 2 Accent 6" w:uiPriority="68"/>
-    <w:lsdException w:name="Medium Grid 3 Accent 6" w:uiPriority="69"/>
-    <w:lsdException w:name="Dark List Accent 6" w:uiPriority="70"/>
-    <w:lsdException w:name="Colorful Shading Accent 6" w:uiPriority="71"/>
-    <w:lsdException w:name="Colorful List Accent 6" w:uiPriority="72"/>
-    <w:lsdException w:name="Colorful Grid Accent 6" w:uiPriority="73"/>
-    <w:lsdException w:name="Subtle Emphasis" w:uiPriority="19" w:qFormat="1"/>
-    <w:lsdException w:name="Intense Emphasis" w:uiPriority="21" w:qFormat="1"/>
-    <w:lsdException w:name="Subtle Reference" w:uiPriority="31" w:qFormat="1"/>
-    <w:lsdException w:name="Intense Reference" w:uiPriority="32" w:qFormat="1"/>
-    <w:lsdException w:name="Book Title" w:uiPriority="33" w:qFormat="1"/>
-    <w:lsdException w:name="Bibliography" w:semiHidden="1" w:uiPriority="37" w:unhideWhenUsed="1"/>
-    <w:lsdException w:name="TOC Heading" w:semiHidden="1" w:uiPriority="39" w:unhideWhenUsed="1" w:qFormat="1"/>
-    <w:lsdException w:name="Plain Table 1" w:uiPriority="41"/>
-    <w:lsdException w:name="Plain Table 2" w:uiPriority="42"/>
-    <w:lsdException w:name="Plain Table 3" w:uiPriority="43"/>
-    <w:lsdException w:name="Plain Table 4" w:uiPriority="44"/>
-    <w:lsdException w:name="Plain Table 5" w:uiPriority="45"/>
-    <w:lsdException w:name="Grid Table Light" w:uiPriority="40"/>
-    <w:lsdException w:name="Grid Table 1 Light" w:uiPriority="46"/>
-    <w:lsdException w:name="Grid Table 2" w:uiPriority="47"/>
-    <w:lsdException w:name="Grid Table 3" w:uiPriority="48"/>
-    <w:lsdException w:name="Grid Table 4" w:uiPriority="49"/>
-    <w:lsdException w:name="Grid Table 5 Dark" w:uiPriority="50"/>
-    <w:lsdException w:name="Grid Table 6 Colorful" w:uiPriority="51"/>
-    <w:lsdException w:name="Grid Table 7 Colorful" w:uiPriority="52"/>
-    <w:lsdException w:name="Grid Table 1 Light Accent 1" w:uiPriority="46"/>
-    <w:lsdException w:name="Grid Table 2 Accent 1" w:uiPriority="47"/>
-    <w:lsdException w:name="Grid Table 3 Accent 1" w:uiPriority="48"/>
-    <w:lsdException w:name="Grid Table 4 Accent 1" w:uiPriority="49"/>
-    <w:lsdException w:name="Grid Table 5 Dark Accent 1" w:uiPriority="50"/>
-    <w:lsdException w:name="Grid Table 6 Colorful Accent 1" w:uiPriority="51"/>
-    <w:lsdException w:name="Grid Table 7 Colorful Accent 1" w:uiPriority="52"/>
-    <w:lsdException w:name="Grid Table 1 Light Accent 2" w:uiPriority="46"/>
-    <w:lsdException w:name="Grid Table 2 Accent 2" w:uiPriority="47"/>
-    <w:lsdException w:name="Grid Table 3 Accent 2" w:uiPriority="48"/>
-    <w:lsdException w:name="Grid Table 4 Accent 2" w:uiPriority="49"/>
-    <w:lsdException w:name="Grid Table 5 Dark Accent 2" w:uiPriority="50"/>
-    <w:lsdException w:name="Grid Table 6 Colorful Accent 2" w:uiPriority="51"/>
-    <w:lsdException w:name="Grid Table 7 Colorful Accent 2" w:uiPriority="52"/>
-    <w:lsdException w:name="Grid Table 1 Light Accent 3" w:uiPriority="46"/>
-    <w:lsdException w:name="Grid Table 2 Accent 3" w:uiPriority="47"/>
-    <w:lsdException w:name="Grid Table 3 Accent 3" w:uiPriority="48"/>
-    <w:lsdException w:name="Grid Table 4 Accent 3" w:uiPriority="49"/>
-    <w:lsdException w:name="Grid Table 5 Dark Accent 3" w:uiPriority="50"/>
-    <w:lsdException w:name="Grid Table 6 Colorful Accent 3" w:uiPriority="51"/>
-    <w:lsdException w:name="Grid Table 7 Colorful Accent 3" w:uiPriority="52"/>
-    <w:lsdException w:name="Grid Table 1 Light Accent 4" w:uiPriority="46"/>
-    <w:lsdException w:name="Grid Table 2 Accent 4" w:uiPriority="47"/>
-    <w:lsdException w:name="Grid Table 3 Accent 4" w:uiPriority="48"/>
-    <w:lsdException w:name="Grid Table 4 Accent 4" w:uiPriority="49"/>
-    <w:lsdException w:name="Grid Table 5 Dark Accent 4" w:uiPriority="50"/>
-    <w:lsdException w:name="Grid Table 6 Colorful Accent 4" w:uiPriority="51"/>
-    <w:lsdException w:name="Grid Table 7 Colorful Accent 4" w:uiPriority="52"/>
-    <w:lsdException w:name="Grid Table 1 Light Accent 5" w:uiPriority="46"/>
-    <w:lsdException w:name="Grid Table 2 Accent 5" w:uiPriority="47"/>
-    <w:lsdException w:name="Grid Table 3 Accent 5" w:uiPriority="48"/>
-    <w:lsdException w:name="Grid Table 4 Accent 5" w:uiPriority="49"/>
-    <w:lsdException w:name="Grid Table 5 Dark Accent 5" w:uiPriority="50"/>
-    <w:lsdException w:name="Grid Table 6 Colorful Accent 5" w:uiPriority="51"/>
-    <w:lsdException w:name="Grid Table 7 Colorful Accent 5" w:uiPriority="52"/>
-    <w:lsdException w:name="Grid Table 1 Light Accent 6" w:uiPriority="46"/>
-    <w:lsdException w:name="Grid Table 2 Accent 6" w:uiPriority="47"/>
-    <w:lsdException w:name="Grid Table 3 Accent 6" w:uiPriority="48"/>
-    <w:lsdException w:name="Grid Table 4 Accent 6" w:uiPriority="49"/>
-    <w:lsdException w:name="Grid Table 5 Dark Accent 6" w:uiPriority="50"/>
-    <w:lsdException w:name="Grid Table 6 Colorful Accent 6" w:uiPriority="51"/>
-    <w:lsdException w:name="Grid Table 7 Colorful Accent 6" w:uiPriority="52"/>
-    <w:lsdException w:name="List Table 1 Light" w:uiPriority="46"/>
-    <w:lsdException w:name="List Table 2" w:uiPriority="47"/>
-    <w:lsdException w:name="List Table 3" w:uiPriority="48"/>
-    <w:lsdException w:name="List Table 4" w:uiPriority="49"/>
-    <w:lsdException w:name="List Table 5 Dark" w:uiPriority="50"/>
-    <w:lsdException w:name="List Table 6 Colorful" w:uiPriority="51"/>
-    <w:lsdException w:name="List Table 7 Colorful" w:uiPriority="52"/>
-    <w:lsdException w:name="List Table 1 Light Accent 1" w:uiPriority="46"/>
-    <w:lsdException w:name="List Table 2 Accent 1" w:uiPriority="47"/>
-    <w:lsdException w:name="List Table 3 Accent 1" w:uiPriority="48"/>
-    <w:lsdException w:name="List Table 4 Accent 1" w:uiPriority="49"/>
-    <w:lsdException w:name="List Table 5 Dark Accent 1" w:uiPriority="50"/>
-    <w:lsdException w:name="List Table 6 Colorful Accent 1" w:uiPriority="51"/>
-    <w:lsdException w:name="List Table 7 Colorful Accent 1" w:uiPriority="52"/>
-    <w:lsdException w:name="List Table 1 Light Accent 2" w:uiPriority="46"/>
-    <w:lsdException w:name="List Table 2 Accent 2" w:uiPriority="47"/>
-    <w:lsdException w:name="List Table 3 Accent 2" w:uiPriority="48"/>
-    <w:lsdException w:name="List Table 4 Accent 2" w:uiPriority="49"/>
-    <w:lsdException w:name="List Table 5 Dark Accent 2" w:uiPriority="50"/>
-    <w:lsdException w:name="List Table 6 Colorful Accent 2" w:uiPriority="51"/>
-    <w:lsdException w:name="List Table 7 Colorful Accent 2" w:uiPriority="52"/>
-    <w:lsdException w:name="List Table 1 Light Accent 3" w:uiPriority="46"/>
-    <w:lsdException w:name="List Table 2 Accent 3" w:uiPriority="47"/>
-    <w:lsdException w:name="List Table 3 Accent 3" w:uiPriority="48"/>
-    <w:lsdException w:name="List Table 4 Accent 3" w:uiPriority="49"/>
-    <w:lsdException w:name="List Table 5 Dark Accent 3" w:uiPriority="50"/>
-    <w:lsdException w:name="List Table 6 Colorful Accent 3" w:uiPriority="51"/>
-    <w:lsdException w:name="List Table 7 Colorful Accent 3" w:uiPriority="52"/>
-    <w:lsdException w:name="List Table 1 Light Accent 4" w:uiPriority="46"/>
-    <w:lsdException w:name="List Table 2 Accent 4" w:uiPriority="47"/>
-    <w:lsdException w:name="List Table 3 Accent 4" w:uiPriority="48"/>
-    <w:lsdException w:name="List Table 4 Accent 4" w:uiPriority="49"/>
-    <w:lsdException w:name="List Table 5 Dark Accent 4" w:uiPriority="50"/>
-    <w:lsdException w:name="List Table 6 Colorful Accent 4" w:uiPriority="51"/>
-    <w:lsdException w:name="List Table 7 Colorful Accent 4" w:uiPriority="52"/>
-    <w:lsdException w:name="List Table 1 Light Accent 5" w:uiPriority="46"/>
-    <w:lsdException w:name="List Table 2 Accent 5" w:uiPriority="47"/>
-    <w:lsdException w:name="List Table 3 Accent 5" w:uiPriority="48"/>
-    <w:lsdException w:name="List Table 4 Accent 5" w:uiPriority="49"/>
-    <w:lsdException w:name="List Table 5 Dark Accent 5" w:uiPriority="50"/>
-    <w:lsdException w:name="List Table 6 Colorful Accent 5" w:uiPriority="51"/>
-    <w:lsdException w:name="List Table 7 Colorful Accent 5" w:uiPriority="52"/>
-    <w:lsdException w:name="List Table 1 Light Accent 6" w:uiPriority="46"/>
-    <w:lsdException w:name="List Table 2 Accent 6" w:uiPriority="47"/>
-    <w:lsdException w:name="List Table 3 Accent 6" w:uiPriority="48"/>
-    <w:lsdException w:name="List Table 4 Accent 6" w:uiPriority="49"/>
-    <w:lsdException w:name="List Table 5 Dark Accent 6" w:uiPriority="50"/>
-    <w:lsdException w:name="List Table 6 Colorful Accent 6" w:uiPriority="51"/>
-    <w:lsdException w:name="List Table 7 Colorful Accent 6" w:uiPriority="52"/>
-  </w:latentStyles>
-  <w:style w:type="paragraph" w:default="1" w:styleId="Normal">
-    <w:name w:val="Normal"/>
-    <w:qFormat/>
-  </w:style>
-  <w:style w:type="character" w:default="1" w:styleId="Fuentedeprrafopredeter">
-    <w:name w:val="Default Paragraph Font"/>
-    <w:uiPriority w:val="1"/>
-    <w:semiHidden/>
-    <w:unhideWhenUsed/>
-  </w:style>
-  <w:style w:type="table" w:default="1" w:styleId="Tablanormal">
-    <w:name w:val="Normal Table"/>
-    <w:uiPriority w:val="99"/>
-    <w:semiHidden/>
-    <w:unhideWhenUsed/>
-    <w:tblPr>
-      <w:tblInd w:w="0" w:type="dxa"/>
-      <w:tblCellMar>
-        <w:top w:w="0" w:type="dxa"/>
-        <w:left w:w="108" w:type="dxa"/>
-        <w:bottom w:w="0" w:type="dxa"/>
-        <w:right w:w="108" w:type="dxa"/>
-      </w:tblCellMar>
-    </w:tblPr>
-  </w:style>
-  <w:style w:type="numbering" w:default="1" w:styleId="Sinlista">
-    <w:name w:val="No List"/>
-    <w:uiPriority w:val="99"/>
-    <w:semiHidden/>
-    <w:unhideWhenUsed/>
-  </w:style>
-</w:styles>
-</file>
-
-<file path=word/glossary/webSettings.xml><?xml version="1.0" encoding="utf-8"?>
-<w:webSettings xmlns:mc="http://schemas.openxmlformats.org/markup-compatibility/2006" xmlns:r="http://schemas.openxmlformats.org/officeDocument/2006/relationships" xmlns:w="http://schemas.openxmlformats.org/wordprocessingml/2006/main" xmlns:w14="http://schemas.microsoft.com/office/word/2010/wordml" xmlns:w15="http://schemas.microsoft.com/office/word/2012/wordml" xmlns:w16se="http://schemas.microsoft.com/office/word/2015/wordml/symex" mc:Ignorable="w14 w15 w16se"/>
 </file>
 
 <file path=word/theme/theme1.xml><?xml version="1.0" encoding="utf-8"?>
@@ -8852,15 +8399,6 @@
 </file>
 
 <file path=customXml/item1.xml><?xml version="1.0" encoding="utf-8"?>
-<?mso-contentType ?>
-<FormTemplates xmlns="http://schemas.microsoft.com/sharepoint/v3/contenttype/forms">
-  <Display>DocumentLibraryForm</Display>
-  <Edit>DocumentLibraryForm</Edit>
-  <New>DocumentLibraryForm</New>
-</FormTemplates>
-</file>
-
-<file path=customXml/item2.xml><?xml version="1.0" encoding="utf-8"?>
 <ct:contentTypeSchema xmlns:ct="http://schemas.microsoft.com/office/2006/metadata/contentType" xmlns:ma="http://schemas.microsoft.com/office/2006/metadata/properties/metaAttributes" ct:_="" ma:_="" ma:contentTypeName="Documento" ma:contentTypeID="0x010100E96778489EE7714D8BD12CC105EB918B" ma:contentTypeVersion="2" ma:contentTypeDescription="Crear nuevo documento." ma:contentTypeScope="" ma:versionID="416c5c7ae9b5d54d83875cd3c65194e3">
   <xsd:schema xmlns:xsd="http://www.w3.org/2001/XMLSchema" xmlns:xs="http://www.w3.org/2001/XMLSchema" xmlns:p="http://schemas.microsoft.com/office/2006/metadata/properties" xmlns:ns2="126e8a1c-9ea9-435a-ac89-d06c80d62e30" targetNamespace="http://schemas.microsoft.com/office/2006/metadata/properties" ma:root="true" ma:fieldsID="70a237c842677bd850644f8595079f5e" ns2:_="">
     <xsd:import namespace="126e8a1c-9ea9-435a-ac89-d06c80d62e30"/>
@@ -8992,25 +8530,26 @@
 </ct:contentTypeSchema>
 </file>
 
+<file path=customXml/item2.xml><?xml version="1.0" encoding="utf-8"?>
+<?mso-contentType ?>
+<FormTemplates xmlns="http://schemas.microsoft.com/sharepoint/v3/contenttype/forms">
+  <Display>DocumentLibraryForm</Display>
+  <Edit>DocumentLibraryForm</Edit>
+  <New>DocumentLibraryForm</New>
+</FormTemplates>
+</file>
+
 <file path=customXml/item3.xml><?xml version="1.0" encoding="utf-8"?>
+<b:Sources xmlns:b="http://schemas.openxmlformats.org/officeDocument/2006/bibliography" xmlns="http://schemas.openxmlformats.org/officeDocument/2006/bibliography" SelectedStyle="\APASixthEditionOfficeOnline.xsl" StyleName="APA" Version="6"/>
+</file>
+
+<file path=customXml/item4.xml><?xml version="1.0" encoding="utf-8"?>
 <p:properties xmlns:p="http://schemas.microsoft.com/office/2006/metadata/properties" xmlns:xsi="http://www.w3.org/2001/XMLSchema-instance" xmlns:pc="http://schemas.microsoft.com/office/infopath/2007/PartnerControls">
   <documentManagement/>
 </p:properties>
 </file>
 
-<file path=customXml/item4.xml><?xml version="1.0" encoding="utf-8"?>
-<b:Sources xmlns:b="http://schemas.openxmlformats.org/officeDocument/2006/bibliography" xmlns="http://schemas.openxmlformats.org/officeDocument/2006/bibliography" SelectedStyle="\APASixthEditionOfficeOnline.xsl" StyleName="APA" Version="6"/>
-</file>
-
 <file path=customXml/itemProps1.xml><?xml version="1.0" encoding="utf-8"?>
-<ds:datastoreItem xmlns:ds="http://schemas.openxmlformats.org/officeDocument/2006/customXml" ds:itemID="{DABAA964-10BA-4DBC-ABF2-CDEAC0FAF7AA}">
-  <ds:schemaRefs>
-    <ds:schemaRef ds:uri="http://schemas.microsoft.com/sharepoint/v3/contenttype/forms"/>
-  </ds:schemaRefs>
-</ds:datastoreItem>
-</file>
-
-<file path=customXml/itemProps2.xml><?xml version="1.0" encoding="utf-8"?>
 <ds:datastoreItem xmlns:ds="http://schemas.openxmlformats.org/officeDocument/2006/customXml" ds:itemID="{0DBFA5EC-D8FC-425E-9DFF-39C8E6B80B6D}">
   <ds:schemaRefs>
     <ds:schemaRef ds:uri="http://schemas.microsoft.com/office/2006/metadata/contentType"/>
@@ -9028,26 +8567,27 @@
 </ds:datastoreItem>
 </file>
 
+<file path=customXml/itemProps2.xml><?xml version="1.0" encoding="utf-8"?>
+<ds:datastoreItem xmlns:ds="http://schemas.openxmlformats.org/officeDocument/2006/customXml" ds:itemID="{DABAA964-10BA-4DBC-ABF2-CDEAC0FAF7AA}">
+  <ds:schemaRefs>
+    <ds:schemaRef ds:uri="http://schemas.microsoft.com/sharepoint/v3/contenttype/forms"/>
+  </ds:schemaRefs>
+</ds:datastoreItem>
+</file>
+
 <file path=customXml/itemProps3.xml><?xml version="1.0" encoding="utf-8"?>
-<ds:datastoreItem xmlns:ds="http://schemas.openxmlformats.org/officeDocument/2006/customXml" ds:itemID="{5F1783E3-BA1C-4CA3-8E32-C9B378BBED03}">
+<ds:datastoreItem xmlns:ds="http://schemas.openxmlformats.org/officeDocument/2006/customXml" ds:itemID="{C841A8A6-B63A-444A-91B2-10973298D867}">
   <ds:schemaRefs>
-    <ds:schemaRef ds:uri="http://purl.org/dc/terms/"/>
-    <ds:schemaRef ds:uri="http://schemas.microsoft.com/office/2006/metadata/properties"/>
-    <ds:schemaRef ds:uri="http://schemas.openxmlformats.org/package/2006/metadata/core-properties"/>
-    <ds:schemaRef ds:uri="http://schemas.microsoft.com/office/infopath/2007/PartnerControls"/>
-    <ds:schemaRef ds:uri="http://www.w3.org/XML/1998/namespace"/>
-    <ds:schemaRef ds:uri="http://schemas.microsoft.com/office/2006/documentManagement/types"/>
-    <ds:schemaRef ds:uri="http://purl.org/dc/elements/1.1/"/>
-    <ds:schemaRef ds:uri="126e8a1c-9ea9-435a-ac89-d06c80d62e30"/>
-    <ds:schemaRef ds:uri="http://purl.org/dc/dcmitype/"/>
+    <ds:schemaRef ds:uri="http://schemas.openxmlformats.org/officeDocument/2006/bibliography"/>
   </ds:schemaRefs>
 </ds:datastoreItem>
 </file>
 
 <file path=customXml/itemProps4.xml><?xml version="1.0" encoding="utf-8"?>
-<ds:datastoreItem xmlns:ds="http://schemas.openxmlformats.org/officeDocument/2006/customXml" ds:itemID="{C841A8A6-B63A-444A-91B2-10973298D867}">
+<ds:datastoreItem xmlns:ds="http://schemas.openxmlformats.org/officeDocument/2006/customXml" ds:itemID="{5F1783E3-BA1C-4CA3-8E32-C9B378BBED03}">
   <ds:schemaRefs>
-    <ds:schemaRef ds:uri="http://schemas.openxmlformats.org/officeDocument/2006/bibliography"/>
+    <ds:schemaRef ds:uri="http://schemas.microsoft.com/office/2006/metadata/properties"/>
+    <ds:schemaRef ds:uri="http://schemas.microsoft.com/office/infopath/2007/PartnerControls"/>
   </ds:schemaRefs>
 </ds:datastoreItem>
 </file>
</xml_diff>